<commit_message>
Update Haftalık Takip Dokümantasyonu.docx
</commit_message>
<xml_diff>
--- a/Haftalık Takip Dokümantasyonu.docx
+++ b/Haftalık Takip Dokümantasyonu.docx
@@ -137,8 +137,13 @@
       </w:r>
     </w:p>
     <w:p>
-      <w:r>
-        <w:t>maddeleri yapıldı.</w:t>
+      <w:proofErr w:type="gramStart"/>
+      <w:r>
+        <w:t>maddeleri</w:t>
+      </w:r>
+      <w:proofErr w:type="gramEnd"/>
+      <w:r>
+        <w:t xml:space="preserve"> yapıldı.</w:t>
       </w:r>
     </w:p>
     <w:p/>
@@ -163,13 +168,7 @@
     </w:p>
     <w:p>
       <w:r>
-        <w:rPr>
-          <w:highlight w:val="yellow"/>
-        </w:rPr>
-        <w:t>- Favorilere ekleme/çıkarma yapabilir</w:t>
-      </w:r>
-      <w:r>
-        <w:t xml:space="preserve">  </w:t>
+        <w:t xml:space="preserve">- Favorilere ekleme/çıkarma yapabilir  </w:t>
       </w:r>
       <w:r>
         <w:sym w:font="Wingdings" w:char="F0E0"/>
@@ -180,9 +179,6 @@
     </w:p>
     <w:p>
       <w:r>
-        <w:rPr>
-          <w:highlight w:val="yellow"/>
-        </w:rPr>
         <w:t>Şuanlık ana ekranda örnek mock ilanlar var, sonraki haftalarda database bağlantısı yapılıp bilgiler çekilecek.</w:t>
       </w:r>
       <w:r>
@@ -404,22 +400,16 @@
     </w:p>
     <w:p>
       <w:r>
-        <w:t xml:space="preserve">- </w:t>
-      </w:r>
-      <w:r>
-        <w:rPr>
-          <w:highlight w:val="yellow"/>
-        </w:rPr>
-        <w:t>Giriş yapmış kullanıcıya profil bilgilerini gösterir</w:t>
-      </w:r>
-      <w:r>
-        <w:t xml:space="preserve">  </w:t>
+        <w:t xml:space="preserve">- Giriş yapmış kullanıcıya profil bilgilerini gösterir  </w:t>
       </w:r>
       <w:r>
         <w:sym w:font="Wingdings" w:char="F0E0"/>
       </w:r>
       <w:r>
-        <w:t xml:space="preserve"> geliştirilecek </w:t>
+        <w:t xml:space="preserve"> geliştirilecek</w:t>
+      </w:r>
+      <w:r>
+        <w:t xml:space="preserve"> </w:t>
       </w:r>
     </w:p>
     <w:p>
@@ -554,6 +544,7 @@
       <w:pPr>
         <w:ind w:firstLine="360"/>
       </w:pPr>
+      <w:proofErr w:type="gramStart"/>
       <w:r>
         <w:rPr>
           <w:b/>
@@ -562,7 +553,11 @@
         <w:t>Dosya:</w:t>
       </w:r>
       <w:r>
-        <w:t>`MyApp/context/AuthContext.tsx`</w:t>
+        <w:t>`</w:t>
+      </w:r>
+      <w:proofErr w:type="gramEnd"/>
+      <w:r>
+        <w:t>MyApp/context/AuthContext.tsx`</w:t>
       </w:r>
     </w:p>
     <w:p>
@@ -570,7 +565,15 @@
         <w:ind w:left="360"/>
       </w:pPr>
       <w:r>
-        <w:t>- `profile.tsx`'deki buton `login()` fonksiyonunu çağrıyor</w:t>
+        <w:t>- `profile.tsx`'deki buton `</w:t>
+      </w:r>
+      <w:proofErr w:type="gramStart"/>
+      <w:r>
+        <w:t>login(</w:t>
+      </w:r>
+      <w:proofErr w:type="gramEnd"/>
+      <w:r>
+        <w:t>)` fonksiyonunu çağrıyor</w:t>
       </w:r>
     </w:p>
     <w:p>
@@ -578,7 +581,15 @@
         <w:ind w:left="360"/>
       </w:pPr>
       <w:r>
-        <w:t>- Bu `login()`, `AuthContext.tsx` dosyasından geliyor</w:t>
+        <w:t>- Bu `</w:t>
+      </w:r>
+      <w:proofErr w:type="gramStart"/>
+      <w:r>
+        <w:t>login(</w:t>
+      </w:r>
+      <w:proofErr w:type="gramEnd"/>
+      <w:r>
+        <w:t>)`, `AuthContext.tsx` dosyasından geliyor</w:t>
       </w:r>
     </w:p>
     <w:p>
@@ -586,7 +597,15 @@
         <w:ind w:left="360"/>
       </w:pPr>
       <w:r>
-        <w:t>- `login()` fonksiyonu API'ye çağrı yapmaya hazırlanıyor</w:t>
+        <w:t>- `</w:t>
+      </w:r>
+      <w:proofErr w:type="gramStart"/>
+      <w:r>
+        <w:t>login(</w:t>
+      </w:r>
+      <w:proofErr w:type="gramEnd"/>
+      <w:r>
+        <w:t>)` fonksiyonu API'ye çağrı yapmaya hazırlanıyor</w:t>
       </w:r>
     </w:p>
     <w:p>
@@ -614,6 +633,7 @@
       <w:pPr>
         <w:ind w:firstLine="360"/>
       </w:pPr>
+      <w:proofErr w:type="gramStart"/>
       <w:r>
         <w:rPr>
           <w:b/>
@@ -622,7 +642,11 @@
         <w:t>Dosya:</w:t>
       </w:r>
       <w:r>
-        <w:t>`MyApp/services/authService.ts`</w:t>
+        <w:t>`</w:t>
+      </w:r>
+      <w:proofErr w:type="gramEnd"/>
+      <w:r>
+        <w:t>MyApp/services/authService.ts`</w:t>
       </w:r>
     </w:p>
     <w:p>
@@ -630,7 +654,15 @@
         <w:ind w:left="360"/>
       </w:pPr>
       <w:r>
-        <w:t>- `AuthContext`'deki `login()`, `authService.ts`'den `loginApi()` fonksiyonunu çağrıyor</w:t>
+        <w:t>- `AuthContext`'deki `</w:t>
+      </w:r>
+      <w:proofErr w:type="gramStart"/>
+      <w:r>
+        <w:t>login(</w:t>
+      </w:r>
+      <w:proofErr w:type="gramEnd"/>
+      <w:r>
+        <w:t>)`, `authService.ts`'den `loginApi()` fonksiyonunu çağrıyor</w:t>
       </w:r>
     </w:p>
     <w:p>
@@ -638,7 +670,15 @@
         <w:ind w:left="360"/>
       </w:pPr>
       <w:r>
-        <w:t>- `loginApi()`, email + şifreyi alıyor</w:t>
+        <w:t>- `</w:t>
+      </w:r>
+      <w:proofErr w:type="gramStart"/>
+      <w:r>
+        <w:t>loginApi(</w:t>
+      </w:r>
+      <w:proofErr w:type="gramEnd"/>
+      <w:r>
+        <w:t>)`, email + şifreyi alıyor</w:t>
       </w:r>
     </w:p>
     <w:p>
@@ -731,7 +771,15 @@
         <w:ind w:left="360"/>
       </w:pPr>
       <w:r>
-        <w:t>  email: "ali@example.com",</w:t>
+        <w:t xml:space="preserve">  </w:t>
+      </w:r>
+      <w:proofErr w:type="gramStart"/>
+      <w:r>
+        <w:t>email</w:t>
+      </w:r>
+      <w:proofErr w:type="gramEnd"/>
+      <w:r>
+        <w:t>: "ali@example.com",</w:t>
       </w:r>
     </w:p>
     <w:p>
@@ -739,7 +787,15 @@
         <w:ind w:left="360"/>
       </w:pPr>
       <w:r>
-        <w:t>  password: "123456"</w:t>
+        <w:t xml:space="preserve">  </w:t>
+      </w:r>
+      <w:proofErr w:type="gramStart"/>
+      <w:r>
+        <w:t>password</w:t>
+      </w:r>
+      <w:proofErr w:type="gramEnd"/>
+      <w:r>
+        <w:t>: "123456"</w:t>
       </w:r>
     </w:p>
     <w:p>
@@ -782,14 +838,30 @@
           <w:b/>
           <w:bCs/>
         </w:rPr>
-        <w:t xml:space="preserve">5- </w:t>
-      </w:r>
-      <w:r>
-        <w:rPr>
-          <w:b/>
-          <w:bCs/>
-        </w:rPr>
-        <w:t xml:space="preserve"> Backend Kontrolü ve Doğrulama</w:t>
+        <w:t>5</w:t>
+      </w:r>
+      <w:proofErr w:type="gramStart"/>
+      <w:r>
+        <w:rPr>
+          <w:b/>
+          <w:bCs/>
+        </w:rPr>
+        <w:t xml:space="preserve">- </w:t>
+      </w:r>
+      <w:r>
+        <w:rPr>
+          <w:b/>
+          <w:bCs/>
+        </w:rPr>
+        <w:t xml:space="preserve"> Backend</w:t>
+      </w:r>
+      <w:proofErr w:type="gramEnd"/>
+      <w:r>
+        <w:rPr>
+          <w:b/>
+          <w:bCs/>
+        </w:rPr>
+        <w:t xml:space="preserve"> Kontrolü ve Doğrulama</w:t>
       </w:r>
     </w:p>
     <w:p>
@@ -1056,14 +1128,30 @@
           <w:bCs/>
         </w:rPr>
         <w:lastRenderedPageBreak/>
-        <w:t xml:space="preserve">7- </w:t>
-      </w:r>
-      <w:r>
-        <w:rPr>
-          <w:b/>
-          <w:bCs/>
-        </w:rPr>
-        <w:t xml:space="preserve"> Backend Yanıt Gönderilyor</w:t>
+        <w:t>7</w:t>
+      </w:r>
+      <w:proofErr w:type="gramStart"/>
+      <w:r>
+        <w:rPr>
+          <w:b/>
+          <w:bCs/>
+        </w:rPr>
+        <w:t xml:space="preserve">- </w:t>
+      </w:r>
+      <w:r>
+        <w:rPr>
+          <w:b/>
+          <w:bCs/>
+        </w:rPr>
+        <w:t xml:space="preserve"> Backend</w:t>
+      </w:r>
+      <w:proofErr w:type="gramEnd"/>
+      <w:r>
+        <w:rPr>
+          <w:b/>
+          <w:bCs/>
+        </w:rPr>
+        <w:t xml:space="preserve"> Yanıt Gönderilyor</w:t>
       </w:r>
     </w:p>
     <w:p>
@@ -1501,26 +1589,41 @@
     <w:p>
       <w:pPr>
         <w:ind w:left="360"/>
+        <w:rPr>
+          <w:b/>
+          <w:bCs/>
+          <w:sz w:val="36"/>
+          <w:szCs w:val="36"/>
+        </w:rPr>
       </w:pPr>
     </w:p>
     <w:p>
       <w:pPr>
         <w:ind w:left="360"/>
-      </w:pPr>
-      <w:r>
-        <w:rPr>
-          <w:b/>
-          <w:bCs/>
-        </w:rPr>
-        <w:t>Video Linki:</w:t>
-      </w:r>
-      <w:r>
-        <w:t xml:space="preserve"> </w:t>
+        <w:rPr>
+          <w:b/>
+          <w:bCs/>
+          <w:sz w:val="40"/>
+          <w:szCs w:val="40"/>
+        </w:rPr>
+      </w:pPr>
+      <w:r>
+        <w:rPr>
+          <w:b/>
+          <w:bCs/>
+          <w:sz w:val="40"/>
+          <w:szCs w:val="40"/>
+        </w:rPr>
+        <w:t xml:space="preserve">Video Linki: </w:t>
       </w:r>
       <w:hyperlink r:id="rId8" w:history="1">
         <w:r>
           <w:rPr>
             <w:rStyle w:val="Kpr"/>
+            <w:b/>
+            <w:bCs/>
+            <w:sz w:val="40"/>
+            <w:szCs w:val="40"/>
           </w:rPr>
           <w:t>https://youtu.be/w8YeCgszcuM</w:t>
         </w:r>
@@ -1642,8 +1745,13 @@
           <w:numId w:val="7"/>
         </w:numPr>
       </w:pPr>
-      <w:r>
-        <w:t>getAllListings() çağrılır</w:t>
+      <w:proofErr w:type="gramStart"/>
+      <w:r>
+        <w:t>getAllListings(</w:t>
+      </w:r>
+      <w:proofErr w:type="gramEnd"/>
+      <w:r>
+        <w:t>) çağrılır</w:t>
       </w:r>
     </w:p>
     <w:p>
@@ -1782,13 +1890,22 @@
           <w:numId w:val="8"/>
         </w:numPr>
       </w:pPr>
+      <w:proofErr w:type="gramStart"/>
       <w:r>
         <w:rPr>
           <w:b/>
           <w:bCs/>
         </w:rPr>
         <w:lastRenderedPageBreak/>
-        <w:t>Mekan Türü Seçimi:</w:t>
+        <w:t>Mekan</w:t>
+      </w:r>
+      <w:proofErr w:type="gramEnd"/>
+      <w:r>
+        <w:rPr>
+          <w:b/>
+          <w:bCs/>
+        </w:rPr>
+        <w:t xml:space="preserve"> Türü Seçimi:</w:t>
       </w:r>
       <w:r>
         <w:t xml:space="preserve"> Ev, daire, tekne, kamp aracı gibi seçenekler arasından mekanı en iyi tanımlayan tür seçilir.</w:t>
@@ -1827,7 +1944,15 @@
         <w:t>Açıklama:</w:t>
       </w:r>
       <w:r>
-        <w:t xml:space="preserve"> Mekanın özellikleri ve çevresi hakkında detaylı metin girişi yapılır.</w:t>
+        <w:t xml:space="preserve"> </w:t>
+      </w:r>
+      <w:proofErr w:type="gramStart"/>
+      <w:r>
+        <w:t>Mekanın</w:t>
+      </w:r>
+      <w:proofErr w:type="gramEnd"/>
+      <w:r>
+        <w:t xml:space="preserve"> özellikleri ve çevresi hakkında detaylı metin girişi yapılır.</w:t>
       </w:r>
     </w:p>
     <w:p>
@@ -1845,7 +1970,15 @@
         <w:t>Konaklama Türü:</w:t>
       </w:r>
       <w:r>
-        <w:t xml:space="preserve"> Mekanın tamamının mı, özel bir odanın mı yoksa paylaşımlı bir alanın mı kiralandığı belirtilir.</w:t>
+        <w:t xml:space="preserve"> </w:t>
+      </w:r>
+      <w:proofErr w:type="gramStart"/>
+      <w:r>
+        <w:t>Mekanın</w:t>
+      </w:r>
+      <w:proofErr w:type="gramEnd"/>
+      <w:r>
+        <w:t xml:space="preserve"> tamamının mı, özel bir odanın mı yoksa paylaşımlı bir alanın mı kiralandığı belirtilir.</w:t>
       </w:r>
     </w:p>
     <w:p>
@@ -1864,8 +1997,13 @@
       </w:r>
     </w:p>
     <w:p>
-      <w:r>
-        <w:t>Mekanın fiziksel kapasitesiyle ilgili sayısal veriler toplanır:</w:t>
+      <w:proofErr w:type="gramStart"/>
+      <w:r>
+        <w:t>Mekanın</w:t>
+      </w:r>
+      <w:proofErr w:type="gramEnd"/>
+      <w:r>
+        <w:t xml:space="preserve"> fiziksel kapasitesiyle ilgili sayısal veriler toplanır:</w:t>
       </w:r>
     </w:p>
     <w:p>
@@ -1965,8 +2103,13 @@
       </w:r>
     </w:p>
     <w:p>
-      <w:r>
-        <w:t>Mekanın sunduğu imkanlar görsel ikonlar eşliğinde seçilir:</w:t>
+      <w:proofErr w:type="gramStart"/>
+      <w:r>
+        <w:t>Mekanın</w:t>
+      </w:r>
+      <w:proofErr w:type="gramEnd"/>
+      <w:r>
+        <w:t xml:space="preserve"> sunduğu imkanlar görsel ikonlar eşliğinde seçilir:</w:t>
       </w:r>
     </w:p>
     <w:p>
@@ -2169,7 +2312,15 @@
         <w:t>Gece Konaklama Bedeli:</w:t>
       </w:r>
       <w:r>
-        <w:t xml:space="preserve"> Kullanıcı Türk Lirası cinsinden bir rakam belirler.</w:t>
+        <w:t xml:space="preserve"> Kullanıcı Türk </w:t>
+      </w:r>
+      <w:proofErr w:type="gramStart"/>
+      <w:r>
+        <w:t>Lirası</w:t>
+      </w:r>
+      <w:proofErr w:type="gramEnd"/>
+      <w:r>
+        <w:t xml:space="preserve"> cinsinden bir rakam belirler.</w:t>
       </w:r>
     </w:p>
     <w:p>
@@ -2425,33 +2576,15 @@
         </w:drawing>
       </w:r>
     </w:p>
-    <w:p>
-      <w:r>
-        <w:rPr>
-          <w:b/>
-          <w:bCs/>
-        </w:rPr>
-        <w:t>Video linki:</w:t>
-      </w:r>
-      <w:r>
-        <w:t xml:space="preserve"> </w:t>
-      </w:r>
-      <w:hyperlink r:id="rId12" w:history="1">
-        <w:r>
-          <w:rPr>
-            <w:rStyle w:val="Kpr"/>
-          </w:rPr>
-          <w:t>https://youtu.be/1VGvJ3kWY-w</w:t>
-        </w:r>
-      </w:hyperlink>
-    </w:p>
     <w:p/>
     <w:p/>
     <w:p/>
     <w:p/>
-    <w:p/>
-    <w:p>
-      <w:r>
+    <w:p>
+      <w:r>
+        <w:rPr>
+          <w:noProof/>
+        </w:rPr>
         <w:lastRenderedPageBreak/>
         <w:drawing>
           <wp:inline distT="0" distB="0" distL="0" distR="0" wp14:anchorId="77B672C8" wp14:editId="24591147">
@@ -2469,7 +2602,7 @@
                     <pic:cNvPicPr/>
                   </pic:nvPicPr>
                   <pic:blipFill>
-                    <a:blip r:embed="rId13"/>
+                    <a:blip r:embed="rId12"/>
                     <a:stretch>
                       <a:fillRect/>
                     </a:stretch>
@@ -2490,6 +2623,9 @@
         </w:drawing>
       </w:r>
       <w:r>
+        <w:rPr>
+          <w:noProof/>
+        </w:rPr>
         <w:drawing>
           <wp:inline distT="0" distB="0" distL="0" distR="0" wp14:anchorId="50E19F04" wp14:editId="15930CF7">
             <wp:extent cx="2628729" cy="2964290"/>
@@ -2506,7 +2642,7 @@
                     <pic:cNvPicPr/>
                   </pic:nvPicPr>
                   <pic:blipFill>
-                    <a:blip r:embed="rId14"/>
+                    <a:blip r:embed="rId13"/>
                     <a:stretch>
                       <a:fillRect/>
                     </a:stretch>
@@ -2529,6 +2665,9 @@
     </w:p>
     <w:p>
       <w:r>
+        <w:rPr>
+          <w:noProof/>
+        </w:rPr>
         <w:drawing>
           <wp:inline distT="0" distB="0" distL="0" distR="0" wp14:anchorId="1F16AF2C" wp14:editId="6287CE98">
             <wp:extent cx="2582722" cy="2887980"/>
@@ -2545,7 +2684,7 @@
                     <pic:cNvPicPr/>
                   </pic:nvPicPr>
                   <pic:blipFill>
-                    <a:blip r:embed="rId15"/>
+                    <a:blip r:embed="rId14"/>
                     <a:stretch>
                       <a:fillRect/>
                     </a:stretch>
@@ -2566,6 +2705,9 @@
         </w:drawing>
       </w:r>
       <w:r>
+        <w:rPr>
+          <w:noProof/>
+        </w:rPr>
         <w:drawing>
           <wp:inline distT="0" distB="0" distL="0" distR="0" wp14:anchorId="0BCB5E98" wp14:editId="588B038F">
             <wp:extent cx="2579370" cy="2893877"/>
@@ -2582,7 +2724,7 @@
                     <pic:cNvPicPr/>
                   </pic:nvPicPr>
                   <pic:blipFill rotWithShape="1">
-                    <a:blip r:embed="rId16"/>
+                    <a:blip r:embed="rId15"/>
                     <a:srcRect l="1552"/>
                     <a:stretch>
                       <a:fillRect/>
@@ -2614,6 +2756,9 @@
     </w:p>
     <w:p>
       <w:r>
+        <w:rPr>
+          <w:noProof/>
+        </w:rPr>
         <w:drawing>
           <wp:inline distT="0" distB="0" distL="0" distR="0" wp14:anchorId="79CD058B" wp14:editId="782A5D4B">
             <wp:extent cx="2629535" cy="2957411"/>
@@ -2630,7 +2775,7 @@
                     <pic:cNvPicPr/>
                   </pic:nvPicPr>
                   <pic:blipFill>
-                    <a:blip r:embed="rId17"/>
+                    <a:blip r:embed="rId16"/>
                     <a:stretch>
                       <a:fillRect/>
                     </a:stretch>
@@ -2651,6 +2796,9 @@
         </w:drawing>
       </w:r>
       <w:r>
+        <w:rPr>
+          <w:noProof/>
+        </w:rPr>
         <w:drawing>
           <wp:inline distT="0" distB="0" distL="0" distR="0" wp14:anchorId="10E1A942" wp14:editId="2F4D00E3">
             <wp:extent cx="2668932" cy="2985655"/>
@@ -2667,7 +2815,7 @@
                     <pic:cNvPicPr/>
                   </pic:nvPicPr>
                   <pic:blipFill>
-                    <a:blip r:embed="rId18"/>
+                    <a:blip r:embed="rId17"/>
                     <a:stretch>
                       <a:fillRect/>
                     </a:stretch>
@@ -2688,6 +2836,1312 @@
         </w:drawing>
       </w:r>
     </w:p>
+    <w:p>
+      <w:pPr>
+        <w:rPr>
+          <w:b/>
+          <w:bCs/>
+          <w:sz w:val="40"/>
+          <w:szCs w:val="40"/>
+        </w:rPr>
+      </w:pPr>
+      <w:r>
+        <w:rPr>
+          <w:b/>
+          <w:bCs/>
+          <w:sz w:val="40"/>
+          <w:szCs w:val="40"/>
+        </w:rPr>
+        <w:t xml:space="preserve">Video linki: </w:t>
+      </w:r>
+      <w:hyperlink r:id="rId18" w:history="1">
+        <w:r>
+          <w:rPr>
+            <w:rStyle w:val="Kpr"/>
+            <w:b/>
+            <w:bCs/>
+            <w:sz w:val="40"/>
+            <w:szCs w:val="40"/>
+          </w:rPr>
+          <w:t>https://youtu.be/1VGvJ3kWY-w</w:t>
+        </w:r>
+      </w:hyperlink>
+    </w:p>
+    <w:p/>
+    <w:p>
+      <w:pPr>
+        <w:rPr>
+          <w:b/>
+          <w:bCs/>
+          <w:u w:val="single"/>
+        </w:rPr>
+      </w:pPr>
+      <w:r>
+        <w:rPr>
+          <w:b/>
+          <w:bCs/>
+          <w:u w:val="single"/>
+        </w:rPr>
+        <w:t>3. HAFTA</w:t>
+      </w:r>
+      <w:r>
+        <w:rPr>
+          <w:b/>
+          <w:bCs/>
+        </w:rPr>
+        <w:t xml:space="preserve">  </w:t>
+      </w:r>
+      <w:r>
+        <w:rPr>
+          <w:b/>
+          <w:bCs/>
+          <w:i/>
+          <w:iCs/>
+        </w:rPr>
+        <w:t>28.03.2026</w:t>
+      </w:r>
+    </w:p>
+    <w:p>
+      <w:r>
+        <w:t xml:space="preserve">Ana dokümadaki </w:t>
+      </w:r>
+    </w:p>
+    <w:p>
+      <w:pPr>
+        <w:numPr>
+          <w:ilvl w:val="0"/>
+          <w:numId w:val="15"/>
+        </w:numPr>
+        <w:spacing w:after="200" w:line="276" w:lineRule="auto"/>
+        <w:rPr>
+          <w:sz w:val="24"/>
+          <w:szCs w:val="24"/>
+        </w:rPr>
+      </w:pPr>
+      <w:r>
+        <w:rPr>
+          <w:sz w:val="24"/>
+          <w:szCs w:val="24"/>
+        </w:rPr>
+        <w:t>İl</w:t>
+      </w:r>
+      <w:r>
+        <w:rPr>
+          <w:sz w:val="24"/>
+          <w:szCs w:val="24"/>
+        </w:rPr>
+        <w:t>an detay ekranının geliştirilmesi</w:t>
+      </w:r>
+    </w:p>
+    <w:p>
+      <w:r>
+        <w:t>Maddesi yapıldı.</w:t>
+      </w:r>
+    </w:p>
+    <w:p>
+      <w:pPr>
+        <w:rPr>
+          <w:b/>
+          <w:bCs/>
+          <w:sz w:val="24"/>
+          <w:szCs w:val="24"/>
+          <w:u w:val="single"/>
+        </w:rPr>
+      </w:pPr>
+      <w:r>
+        <w:rPr>
+          <w:b/>
+          <w:bCs/>
+          <w:sz w:val="24"/>
+          <w:szCs w:val="24"/>
+          <w:u w:val="single"/>
+        </w:rPr>
+        <w:t>İlan Detay Sayfası</w:t>
+      </w:r>
+    </w:p>
+    <w:p>
+      <w:pPr>
+        <w:rPr>
+          <w:b/>
+          <w:bCs/>
+        </w:rPr>
+      </w:pPr>
+      <w:r>
+        <w:rPr>
+          <w:b/>
+          <w:bCs/>
+        </w:rPr>
+        <w:t>1. Üst Bölüm ve Galeri</w:t>
+      </w:r>
+    </w:p>
+    <w:p>
+      <w:pPr>
+        <w:numPr>
+          <w:ilvl w:val="0"/>
+          <w:numId w:val="16"/>
+        </w:numPr>
+      </w:pPr>
+      <w:r>
+        <w:rPr>
+          <w:b/>
+          <w:bCs/>
+        </w:rPr>
+        <w:t>Navigasyon:</w:t>
+      </w:r>
+      <w:r>
+        <w:t xml:space="preserve"> Fotoğraf galerisi üzerinde konumlanmış, geri dönüş sağlayan floating buton.</w:t>
+      </w:r>
+    </w:p>
+    <w:p>
+      <w:pPr>
+        <w:numPr>
+          <w:ilvl w:val="0"/>
+          <w:numId w:val="16"/>
+        </w:numPr>
+      </w:pPr>
+      <w:r>
+        <w:rPr>
+          <w:b/>
+          <w:bCs/>
+        </w:rPr>
+        <w:t>Fotoğraf Galerisi:</w:t>
+      </w:r>
+      <w:r>
+        <w:t xml:space="preserve"> 300px sabit yükseklikte, tam genişlikte, yatay scroll (snap effect) özellikli yapı. Sağ alt köşede sayfa indikatörü (örn: 2/5).</w:t>
+      </w:r>
+    </w:p>
+    <w:p>
+      <w:pPr>
+        <w:rPr>
+          <w:b/>
+          <w:bCs/>
+        </w:rPr>
+      </w:pPr>
+      <w:r>
+        <w:rPr>
+          <w:b/>
+          <w:bCs/>
+        </w:rPr>
+        <w:t>2. Temel Bilgiler ve Ev Sahibi</w:t>
+      </w:r>
+    </w:p>
+    <w:p>
+      <w:pPr>
+        <w:numPr>
+          <w:ilvl w:val="0"/>
+          <w:numId w:val="17"/>
+        </w:numPr>
+      </w:pPr>
+      <w:r>
+        <w:rPr>
+          <w:b/>
+          <w:bCs/>
+        </w:rPr>
+        <w:t>Başlık &amp; Konum:</w:t>
+      </w:r>
+      <w:r>
+        <w:t xml:space="preserve"> İlan başlığı (Bold) ve hemen altında şehir/ilçe bilgisi.</w:t>
+      </w:r>
+    </w:p>
+    <w:p>
+      <w:pPr>
+        <w:numPr>
+          <w:ilvl w:val="0"/>
+          <w:numId w:val="17"/>
+        </w:numPr>
+      </w:pPr>
+      <w:r>
+        <w:rPr>
+          <w:b/>
+          <w:bCs/>
+        </w:rPr>
+        <w:t>Ev Sahibi Kartı:</w:t>
+      </w:r>
+      <w:r>
+        <w:t xml:space="preserve"> Profil avatara ek olarak ev sahibi ismi ve mülk tipi (Daire, Villa vb.) bilgisi.</w:t>
+      </w:r>
+    </w:p>
+    <w:p>
+      <w:pPr>
+        <w:numPr>
+          <w:ilvl w:val="0"/>
+          <w:numId w:val="17"/>
+        </w:numPr>
+      </w:pPr>
+      <w:r>
+        <w:rPr>
+          <w:b/>
+          <w:bCs/>
+        </w:rPr>
+        <w:t>Mülk Kapasitesi:</w:t>
+      </w:r>
+      <w:r>
+        <w:t xml:space="preserve"> Konuk sayısı, yatak odası, yatak ve banyo sayısını içeren 4 satırlık liste.</w:t>
+      </w:r>
+    </w:p>
+    <w:p>
+      <w:pPr>
+        <w:rPr>
+          <w:b/>
+          <w:bCs/>
+        </w:rPr>
+      </w:pPr>
+      <w:r>
+        <w:rPr>
+          <w:b/>
+          <w:bCs/>
+        </w:rPr>
+        <w:t>3. İçerik Alanları</w:t>
+      </w:r>
+    </w:p>
+    <w:p>
+      <w:pPr>
+        <w:numPr>
+          <w:ilvl w:val="0"/>
+          <w:numId w:val="18"/>
+        </w:numPr>
+      </w:pPr>
+      <w:r>
+        <w:rPr>
+          <w:b/>
+          <w:bCs/>
+        </w:rPr>
+        <w:t>Açıklama:</w:t>
+      </w:r>
+      <w:r>
+        <w:t xml:space="preserve"> "Açıklama" başlığı altında mülke dair detaylı metin bloğu.</w:t>
+      </w:r>
+    </w:p>
+    <w:p>
+      <w:pPr>
+        <w:numPr>
+          <w:ilvl w:val="0"/>
+          <w:numId w:val="18"/>
+        </w:numPr>
+      </w:pPr>
+      <w:r>
+        <w:rPr>
+          <w:b/>
+          <w:bCs/>
+        </w:rPr>
+        <w:t>Olanaklar:</w:t>
+      </w:r>
+      <w:r>
+        <w:t xml:space="preserve"> İkon ve metin eşleşmeli (Wifi, TV, Mutfak vb.) özellik listesi.</w:t>
+      </w:r>
+    </w:p>
+    <w:p>
+      <w:pPr>
+        <w:numPr>
+          <w:ilvl w:val="0"/>
+          <w:numId w:val="18"/>
+        </w:numPr>
+      </w:pPr>
+      <w:r>
+        <w:rPr>
+          <w:b/>
+          <w:bCs/>
+        </w:rPr>
+        <w:t>Adres:</w:t>
+      </w:r>
+      <w:r>
+        <w:t xml:space="preserve"> Sokak/Cadde, İlçe/Şehir ve Ülke bilgilerini içeren 3 satırlı net adres bölümü.</w:t>
+      </w:r>
+    </w:p>
+    <w:p>
+      <w:pPr>
+        <w:numPr>
+          <w:ilvl w:val="0"/>
+          <w:numId w:val="18"/>
+        </w:numPr>
+      </w:pPr>
+      <w:r>
+        <w:rPr>
+          <w:i/>
+          <w:iCs/>
+        </w:rPr>
+        <w:t>Not: Tüm ana bölümler ince gri ayırıcı çizgilerle (divider) birbirinden ayrılır.</w:t>
+      </w:r>
+    </w:p>
+    <w:p>
+      <w:pPr>
+        <w:rPr>
+          <w:b/>
+          <w:bCs/>
+        </w:rPr>
+      </w:pPr>
+      <w:r>
+        <w:rPr>
+          <w:b/>
+          <w:bCs/>
+        </w:rPr>
+        <w:t>4. Sabit Rezervasyon Barı (Sticky Bottom)</w:t>
+      </w:r>
+    </w:p>
+    <w:p>
+      <w:pPr>
+        <w:numPr>
+          <w:ilvl w:val="0"/>
+          <w:numId w:val="19"/>
+        </w:numPr>
+      </w:pPr>
+      <w:r>
+        <w:t>Sayfanın altına sabitlenmiş, scroll’dan bağımsız panel.</w:t>
+      </w:r>
+    </w:p>
+    <w:p>
+      <w:pPr>
+        <w:numPr>
+          <w:ilvl w:val="0"/>
+          <w:numId w:val="19"/>
+        </w:numPr>
+      </w:pPr>
+      <w:r>
+        <w:rPr>
+          <w:b/>
+          <w:bCs/>
+        </w:rPr>
+        <w:t>Sol:</w:t>
+      </w:r>
+      <w:r>
+        <w:t xml:space="preserve"> Gecelik fiyat bilgisi (örn: ₺2.500 / gece).</w:t>
+      </w:r>
+    </w:p>
+    <w:p>
+      <w:pPr>
+        <w:numPr>
+          <w:ilvl w:val="0"/>
+          <w:numId w:val="19"/>
+        </w:numPr>
+      </w:pPr>
+      <w:r>
+        <w:rPr>
+          <w:b/>
+          <w:bCs/>
+        </w:rPr>
+        <w:t>Sağ:</w:t>
+      </w:r>
+      <w:r>
+        <w:t xml:space="preserve"> "Rezervasyon Yap" butonu.</w:t>
+      </w:r>
+    </w:p>
+    <w:p/>
+    <w:p>
+      <w:pPr>
+        <w:rPr>
+          <w:b/>
+          <w:bCs/>
+        </w:rPr>
+      </w:pPr>
+      <w:r>
+        <w:rPr>
+          <w:b/>
+          <w:bCs/>
+        </w:rPr>
+        <w:t>Rezervasyon Akışı ve Modal Yapısı</w:t>
+      </w:r>
+    </w:p>
+    <w:p>
+      <w:pPr>
+        <w:rPr>
+          <w:b/>
+          <w:bCs/>
+        </w:rPr>
+      </w:pPr>
+      <w:r>
+        <w:rPr>
+          <w:b/>
+          <w:bCs/>
+        </w:rPr>
+        <w:t>1. Erişim Kontrolü</w:t>
+      </w:r>
+    </w:p>
+    <w:p>
+      <w:pPr>
+        <w:numPr>
+          <w:ilvl w:val="0"/>
+          <w:numId w:val="20"/>
+        </w:numPr>
+      </w:pPr>
+      <w:r>
+        <w:t>Butona tıklandığında kullanıcı oturumu kontrol edilir; oturum yoksa Login sayfasına, varsa Rezervasyon Modalı’na yönlendirilir.</w:t>
+      </w:r>
+    </w:p>
+    <w:p>
+      <w:pPr>
+        <w:rPr>
+          <w:b/>
+          <w:bCs/>
+        </w:rPr>
+      </w:pPr>
+      <w:r>
+        <w:rPr>
+          <w:b/>
+          <w:bCs/>
+        </w:rPr>
+        <w:t>2. Modal Bileşenleri</w:t>
+      </w:r>
+    </w:p>
+    <w:p>
+      <w:pPr>
+        <w:numPr>
+          <w:ilvl w:val="0"/>
+          <w:numId w:val="21"/>
+        </w:numPr>
+      </w:pPr>
+      <w:r>
+        <w:rPr>
+          <w:b/>
+          <w:bCs/>
+        </w:rPr>
+        <w:t>Header:</w:t>
+      </w:r>
+      <w:r>
+        <w:t xml:space="preserve"> Başlık ve kapatma (X) butonu.</w:t>
+      </w:r>
+    </w:p>
+    <w:p>
+      <w:pPr>
+        <w:numPr>
+          <w:ilvl w:val="0"/>
+          <w:numId w:val="21"/>
+        </w:numPr>
+      </w:pPr>
+      <w:r>
+        <w:rPr>
+          <w:b/>
+          <w:bCs/>
+        </w:rPr>
+        <w:t>Tarih Seçimi:</w:t>
+      </w:r>
+      <w:r>
+        <w:t xml:space="preserve"> Takvim modalını tetikleyen, seçili tarihi veya "Tarih Seçin" uyarısını gösteren buton.</w:t>
+      </w:r>
+    </w:p>
+    <w:p>
+      <w:pPr>
+        <w:numPr>
+          <w:ilvl w:val="0"/>
+          <w:numId w:val="21"/>
+        </w:numPr>
+      </w:pPr>
+      <w:r>
+        <w:rPr>
+          <w:b/>
+          <w:bCs/>
+        </w:rPr>
+        <w:t>Gece ve Konuk Sayacı:</w:t>
+      </w:r>
+      <w:r>
+        <w:t xml:space="preserve"> * Artı/Eksi (stepper) kontrolü.</w:t>
+      </w:r>
+    </w:p>
+    <w:p>
+      <w:pPr>
+        <w:numPr>
+          <w:ilvl w:val="1"/>
+          <w:numId w:val="21"/>
+        </w:numPr>
+      </w:pPr>
+      <w:r>
+        <w:t>Minimum (1) ve Maksimum (Sınır değer) değerlerde butonların pasifleşme (disabled) özelliği.</w:t>
+      </w:r>
+    </w:p>
+    <w:p>
+      <w:pPr>
+        <w:numPr>
+          <w:ilvl w:val="0"/>
+          <w:numId w:val="21"/>
+        </w:numPr>
+      </w:pPr>
+      <w:r>
+        <w:rPr>
+          <w:b/>
+          <w:bCs/>
+        </w:rPr>
+        <w:t>Dinamik Fiyat Özeti:</w:t>
+      </w:r>
+      <w:r>
+        <w:t xml:space="preserve"> * Seçilen gece sayısına göre anlık hesaplanan ara toplam (Birim Fiyat x Gece).</w:t>
+      </w:r>
+    </w:p>
+    <w:p>
+      <w:pPr>
+        <w:numPr>
+          <w:ilvl w:val="1"/>
+          <w:numId w:val="21"/>
+        </w:numPr>
+      </w:pPr>
+      <w:r>
+        <w:t>Vurgulanmış toplam tutar.</w:t>
+      </w:r>
+    </w:p>
+    <w:p>
+      <w:pPr>
+        <w:rPr>
+          <w:b/>
+          <w:bCs/>
+        </w:rPr>
+      </w:pPr>
+      <w:r>
+        <w:rPr>
+          <w:b/>
+          <w:bCs/>
+        </w:rPr>
+        <w:lastRenderedPageBreak/>
+        <w:t>3. İşlem Sonlandırma</w:t>
+      </w:r>
+    </w:p>
+    <w:p>
+      <w:pPr>
+        <w:numPr>
+          <w:ilvl w:val="0"/>
+          <w:numId w:val="22"/>
+        </w:numPr>
+      </w:pPr>
+      <w:r>
+        <w:rPr>
+          <w:b/>
+          <w:bCs/>
+        </w:rPr>
+        <w:t>Onay Butonu:</w:t>
+      </w:r>
+      <w:r>
+        <w:t xml:space="preserve"> "Rezervasyonu Tamamla".</w:t>
+      </w:r>
+    </w:p>
+    <w:p>
+      <w:pPr>
+        <w:numPr>
+          <w:ilvl w:val="0"/>
+          <w:numId w:val="22"/>
+        </w:numPr>
+      </w:pPr>
+      <w:r>
+        <w:rPr>
+          <w:b/>
+          <w:bCs/>
+        </w:rPr>
+        <w:t>Validasyon:</w:t>
+      </w:r>
+      <w:r>
+        <w:t xml:space="preserve"> Tarih ve doluluk kontrolleri.</w:t>
+      </w:r>
+    </w:p>
+    <w:p>
+      <w:pPr>
+        <w:numPr>
+          <w:ilvl w:val="0"/>
+          <w:numId w:val="22"/>
+        </w:numPr>
+      </w:pPr>
+      <w:r>
+        <w:rPr>
+          <w:b/>
+          <w:bCs/>
+        </w:rPr>
+        <w:t>Feedback:</w:t>
+      </w:r>
+      <w:r>
+        <w:t xml:space="preserve"> İşlem sırasında loading animasyonu; işlem sonunda başarı veya hata mesaj</w:t>
+      </w:r>
+    </w:p>
+    <w:p/>
+    <w:p>
+      <w:r>
+        <w:drawing>
+          <wp:anchor distT="0" distB="0" distL="114300" distR="114300" simplePos="0" relativeHeight="251660288" behindDoc="0" locked="0" layoutInCell="1" allowOverlap="1" wp14:anchorId="39F08C54" wp14:editId="35E96828">
+            <wp:simplePos x="0" y="0"/>
+            <wp:positionH relativeFrom="column">
+              <wp:posOffset>0</wp:posOffset>
+            </wp:positionH>
+            <wp:positionV relativeFrom="paragraph">
+              <wp:posOffset>-3175</wp:posOffset>
+            </wp:positionV>
+            <wp:extent cx="4602480" cy="2783536"/>
+            <wp:effectExtent l="0" t="0" r="7620" b="0"/>
+            <wp:wrapThrough wrapText="bothSides">
+              <wp:wrapPolygon edited="0">
+                <wp:start x="0" y="0"/>
+                <wp:lineTo x="0" y="21437"/>
+                <wp:lineTo x="21546" y="21437"/>
+                <wp:lineTo x="21546" y="0"/>
+                <wp:lineTo x="0" y="0"/>
+              </wp:wrapPolygon>
+            </wp:wrapThrough>
+            <wp:docPr id="593886615" name="Resim 1" descr="metin, ekran görüntüsü, yazı tipi içeren bir resim&#10;&#10;Yapay zeka tarafından oluşturulmuş içerik yanlış olabilir."/>
+            <wp:cNvGraphicFramePr>
+              <a:graphicFrameLocks xmlns:a="http://schemas.openxmlformats.org/drawingml/2006/main" noChangeAspect="1"/>
+            </wp:cNvGraphicFramePr>
+            <a:graphic xmlns:a="http://schemas.openxmlformats.org/drawingml/2006/main">
+              <a:graphicData uri="http://schemas.openxmlformats.org/drawingml/2006/picture">
+                <pic:pic xmlns:pic="http://schemas.openxmlformats.org/drawingml/2006/picture">
+                  <pic:nvPicPr>
+                    <pic:cNvPr id="593886615" name="Resim 1" descr="metin, ekran görüntüsü, yazı tipi içeren bir resim&#10;&#10;Yapay zeka tarafından oluşturulmuş içerik yanlış olabilir."/>
+                    <pic:cNvPicPr/>
+                  </pic:nvPicPr>
+                  <pic:blipFill>
+                    <a:blip r:embed="rId19">
+                      <a:extLst>
+                        <a:ext uri="{28A0092B-C50C-407E-A947-70E740481C1C}">
+                          <a14:useLocalDpi xmlns:a14="http://schemas.microsoft.com/office/drawing/2010/main" val="0"/>
+                        </a:ext>
+                      </a:extLst>
+                    </a:blip>
+                    <a:stretch>
+                      <a:fillRect/>
+                    </a:stretch>
+                  </pic:blipFill>
+                  <pic:spPr>
+                    <a:xfrm>
+                      <a:off x="0" y="0"/>
+                      <a:ext cx="4602480" cy="2783536"/>
+                    </a:xfrm>
+                    <a:prstGeom prst="rect">
+                      <a:avLst/>
+                    </a:prstGeom>
+                  </pic:spPr>
+                </pic:pic>
+              </a:graphicData>
+            </a:graphic>
+            <wp14:sizeRelH relativeFrom="page">
+              <wp14:pctWidth>0</wp14:pctWidth>
+            </wp14:sizeRelH>
+            <wp14:sizeRelV relativeFrom="page">
+              <wp14:pctHeight>0</wp14:pctHeight>
+            </wp14:sizeRelV>
+          </wp:anchor>
+        </w:drawing>
+      </w:r>
+      <w:r>
+        <w:t>Sayfa açıldığında, URL'den aldığı ID ile backend'e istek atıp ilan detaylarını çekiyor. Başarılıysa gösteriyor, hata olursa kullanıcıya mesaj veriyor</w:t>
+      </w:r>
+    </w:p>
+    <w:p/>
+    <w:p/>
+    <w:p/>
+    <w:p/>
+    <w:p/>
+    <w:p/>
+    <w:p>
+      <w:pPr>
+        <w:rPr>
+          <w:b/>
+          <w:bCs/>
+          <w:u w:val="single"/>
+        </w:rPr>
+      </w:pPr>
+    </w:p>
+    <w:p>
+      <w:pPr>
+        <w:rPr>
+          <w:b/>
+          <w:bCs/>
+          <w:sz w:val="40"/>
+          <w:szCs w:val="40"/>
+        </w:rPr>
+      </w:pPr>
+      <w:r>
+        <w:drawing>
+          <wp:anchor distT="0" distB="0" distL="114300" distR="114300" simplePos="0" relativeHeight="251661312" behindDoc="0" locked="0" layoutInCell="1" allowOverlap="1" wp14:anchorId="78B19A6F" wp14:editId="3F2B4AF9">
+            <wp:simplePos x="0" y="0"/>
+            <wp:positionH relativeFrom="column">
+              <wp:posOffset>0</wp:posOffset>
+            </wp:positionH>
+            <wp:positionV relativeFrom="paragraph">
+              <wp:posOffset>412115</wp:posOffset>
+            </wp:positionV>
+            <wp:extent cx="4602480" cy="1283970"/>
+            <wp:effectExtent l="0" t="0" r="7620" b="0"/>
+            <wp:wrapThrough wrapText="bothSides">
+              <wp:wrapPolygon edited="0">
+                <wp:start x="0" y="0"/>
+                <wp:lineTo x="0" y="21151"/>
+                <wp:lineTo x="21546" y="21151"/>
+                <wp:lineTo x="21546" y="0"/>
+                <wp:lineTo x="0" y="0"/>
+              </wp:wrapPolygon>
+            </wp:wrapThrough>
+            <wp:docPr id="1380944173" name="Resim 1" descr="metin, ekran görüntüsü, yazı tipi içeren bir resim"/>
+            <wp:cNvGraphicFramePr>
+              <a:graphicFrameLocks xmlns:a="http://schemas.openxmlformats.org/drawingml/2006/main" noChangeAspect="1"/>
+            </wp:cNvGraphicFramePr>
+            <a:graphic xmlns:a="http://schemas.openxmlformats.org/drawingml/2006/main">
+              <a:graphicData uri="http://schemas.openxmlformats.org/drawingml/2006/picture">
+                <pic:pic xmlns:pic="http://schemas.openxmlformats.org/drawingml/2006/picture">
+                  <pic:nvPicPr>
+                    <pic:cNvPr id="1380944173" name="Resim 1" descr="metin, ekran görüntüsü, yazı tipi içeren bir resim"/>
+                    <pic:cNvPicPr/>
+                  </pic:nvPicPr>
+                  <pic:blipFill rotWithShape="1">
+                    <a:blip r:embed="rId20">
+                      <a:extLst>
+                        <a:ext uri="{28A0092B-C50C-407E-A947-70E740481C1C}">
+                          <a14:useLocalDpi xmlns:a14="http://schemas.microsoft.com/office/drawing/2010/main" val="0"/>
+                        </a:ext>
+                      </a:extLst>
+                    </a:blip>
+                    <a:srcRect t="18745"/>
+                    <a:stretch>
+                      <a:fillRect/>
+                    </a:stretch>
+                  </pic:blipFill>
+                  <pic:spPr bwMode="auto">
+                    <a:xfrm>
+                      <a:off x="0" y="0"/>
+                      <a:ext cx="4602480" cy="1283970"/>
+                    </a:xfrm>
+                    <a:prstGeom prst="rect">
+                      <a:avLst/>
+                    </a:prstGeom>
+                    <a:ln>
+                      <a:noFill/>
+                    </a:ln>
+                    <a:extLst>
+                      <a:ext uri="{53640926-AAD7-44D8-BBD7-CCE9431645EC}">
+                        <a14:shadowObscured xmlns:a14="http://schemas.microsoft.com/office/drawing/2010/main"/>
+                      </a:ext>
+                    </a:extLst>
+                  </pic:spPr>
+                </pic:pic>
+              </a:graphicData>
+            </a:graphic>
+            <wp14:sizeRelH relativeFrom="page">
+              <wp14:pctWidth>0</wp14:pctWidth>
+            </wp14:sizeRelH>
+            <wp14:sizeRelV relativeFrom="page">
+              <wp14:pctHeight>0</wp14:pctHeight>
+            </wp14:sizeRelV>
+          </wp:anchor>
+        </w:drawing>
+      </w:r>
+    </w:p>
+    <w:p>
+      <w:r>
+        <w:t>Backend'e gidip, verdiğin ID'ye sahip ilanın tüm detaylarını çekip getiriyor.</w:t>
+      </w:r>
+    </w:p>
+    <w:p>
+      <w:pPr>
+        <w:rPr>
+          <w:sz w:val="24"/>
+          <w:szCs w:val="24"/>
+        </w:rPr>
+      </w:pPr>
+    </w:p>
+    <w:p>
+      <w:pPr>
+        <w:rPr>
+          <w:sz w:val="24"/>
+          <w:szCs w:val="24"/>
+        </w:rPr>
+      </w:pPr>
+    </w:p>
+    <w:p>
+      <w:pPr>
+        <w:rPr>
+          <w:sz w:val="24"/>
+          <w:szCs w:val="24"/>
+        </w:rPr>
+      </w:pPr>
+    </w:p>
+    <w:p>
+      <w:pPr>
+        <w:rPr>
+          <w:sz w:val="24"/>
+          <w:szCs w:val="24"/>
+        </w:rPr>
+      </w:pPr>
+      <w:r>
+        <w:rPr>
+          <w:b/>
+          <w:bCs/>
+          <w:sz w:val="40"/>
+          <w:szCs w:val="40"/>
+        </w:rPr>
+        <w:drawing>
+          <wp:anchor distT="0" distB="0" distL="114300" distR="114300" simplePos="0" relativeHeight="251662336" behindDoc="1" locked="0" layoutInCell="1" allowOverlap="1" wp14:anchorId="16314ACA" wp14:editId="3FC2587A">
+            <wp:simplePos x="0" y="0"/>
+            <wp:positionH relativeFrom="column">
+              <wp:posOffset>0</wp:posOffset>
+            </wp:positionH>
+            <wp:positionV relativeFrom="paragraph">
+              <wp:posOffset>213360</wp:posOffset>
+            </wp:positionV>
+            <wp:extent cx="2926080" cy="1410335"/>
+            <wp:effectExtent l="0" t="0" r="7620" b="0"/>
+            <wp:wrapTight wrapText="bothSides">
+              <wp:wrapPolygon edited="0">
+                <wp:start x="0" y="0"/>
+                <wp:lineTo x="0" y="21299"/>
+                <wp:lineTo x="21516" y="21299"/>
+                <wp:lineTo x="21516" y="0"/>
+                <wp:lineTo x="0" y="0"/>
+              </wp:wrapPolygon>
+            </wp:wrapTight>
+            <wp:docPr id="1157822264" name="Resim 1" descr="metin, yazı tipi, ekran görüntüsü, el yazısı içeren bir resim&#10;&#10;Yapay zeka tarafından oluşturulmuş içerik yanlış olabilir."/>
+            <wp:cNvGraphicFramePr>
+              <a:graphicFrameLocks xmlns:a="http://schemas.openxmlformats.org/drawingml/2006/main" noChangeAspect="1"/>
+            </wp:cNvGraphicFramePr>
+            <a:graphic xmlns:a="http://schemas.openxmlformats.org/drawingml/2006/main">
+              <a:graphicData uri="http://schemas.openxmlformats.org/drawingml/2006/picture">
+                <pic:pic xmlns:pic="http://schemas.openxmlformats.org/drawingml/2006/picture">
+                  <pic:nvPicPr>
+                    <pic:cNvPr id="1157822264" name="Resim 1" descr="metin, yazı tipi, ekran görüntüsü, el yazısı içeren bir resim&#10;&#10;Yapay zeka tarafından oluşturulmuş içerik yanlış olabilir."/>
+                    <pic:cNvPicPr/>
+                  </pic:nvPicPr>
+                  <pic:blipFill>
+                    <a:blip r:embed="rId21">
+                      <a:extLst>
+                        <a:ext uri="{28A0092B-C50C-407E-A947-70E740481C1C}">
+                          <a14:useLocalDpi xmlns:a14="http://schemas.microsoft.com/office/drawing/2010/main" val="0"/>
+                        </a:ext>
+                      </a:extLst>
+                    </a:blip>
+                    <a:stretch>
+                      <a:fillRect/>
+                    </a:stretch>
+                  </pic:blipFill>
+                  <pic:spPr>
+                    <a:xfrm>
+                      <a:off x="0" y="0"/>
+                      <a:ext cx="2926080" cy="1410335"/>
+                    </a:xfrm>
+                    <a:prstGeom prst="rect">
+                      <a:avLst/>
+                    </a:prstGeom>
+                  </pic:spPr>
+                </pic:pic>
+              </a:graphicData>
+            </a:graphic>
+            <wp14:sizeRelH relativeFrom="margin">
+              <wp14:pctWidth>0</wp14:pctWidth>
+            </wp14:sizeRelH>
+            <wp14:sizeRelV relativeFrom="margin">
+              <wp14:pctHeight>0</wp14:pctHeight>
+            </wp14:sizeRelV>
+          </wp:anchor>
+        </w:drawing>
+      </w:r>
+    </w:p>
+    <w:p>
+      <w:pPr>
+        <w:rPr>
+          <w:sz w:val="24"/>
+          <w:szCs w:val="24"/>
+        </w:rPr>
+      </w:pPr>
+    </w:p>
+    <w:p>
+      <w:r>
+        <w:rPr>
+          <w:sz w:val="24"/>
+          <w:szCs w:val="24"/>
+        </w:rPr>
+        <w:t>Re</w:t>
+      </w:r>
+      <w:r>
+        <w:t>zervasyon yapmak isteyene önce giriş kontrolü yapıyor. Giriş yapmamışsa login'e gönderiyor, yaptıysa rezervasyon formunu açıyor.</w:t>
+      </w:r>
+    </w:p>
+    <w:p>
+      <w:pPr>
+        <w:rPr>
+          <w:b/>
+          <w:bCs/>
+          <w:sz w:val="40"/>
+          <w:szCs w:val="40"/>
+        </w:rPr>
+      </w:pPr>
+    </w:p>
+    <w:p>
+      <w:pPr>
+        <w:rPr>
+          <w:b/>
+          <w:bCs/>
+          <w:sz w:val="40"/>
+          <w:szCs w:val="40"/>
+        </w:rPr>
+      </w:pPr>
+    </w:p>
+    <w:p>
+      <w:pPr>
+        <w:rPr>
+          <w:b/>
+          <w:bCs/>
+          <w:sz w:val="40"/>
+          <w:szCs w:val="40"/>
+        </w:rPr>
+      </w:pPr>
+    </w:p>
+    <w:p>
+      <w:pPr>
+        <w:rPr>
+          <w:b/>
+          <w:bCs/>
+          <w:sz w:val="40"/>
+          <w:szCs w:val="40"/>
+        </w:rPr>
+      </w:pPr>
+    </w:p>
+    <w:p>
+      <w:pPr>
+        <w:rPr>
+          <w:b/>
+          <w:bCs/>
+          <w:sz w:val="40"/>
+          <w:szCs w:val="40"/>
+        </w:rPr>
+      </w:pPr>
+    </w:p>
+    <w:p>
+      <w:pPr>
+        <w:rPr>
+          <w:b/>
+          <w:bCs/>
+          <w:sz w:val="40"/>
+          <w:szCs w:val="40"/>
+        </w:rPr>
+      </w:pPr>
+      <w:r>
+        <w:rPr>
+          <w:b/>
+          <w:bCs/>
+          <w:sz w:val="40"/>
+          <w:szCs w:val="40"/>
+        </w:rPr>
+        <w:lastRenderedPageBreak/>
+        <w:drawing>
+          <wp:anchor distT="0" distB="0" distL="114300" distR="114300" simplePos="0" relativeHeight="251663360" behindDoc="0" locked="0" layoutInCell="1" allowOverlap="1" wp14:anchorId="2E103889" wp14:editId="3C9D1795">
+            <wp:simplePos x="0" y="0"/>
+            <wp:positionH relativeFrom="column">
+              <wp:posOffset>10795</wp:posOffset>
+            </wp:positionH>
+            <wp:positionV relativeFrom="paragraph">
+              <wp:posOffset>163195</wp:posOffset>
+            </wp:positionV>
+            <wp:extent cx="3156585" cy="2363470"/>
+            <wp:effectExtent l="0" t="0" r="5715" b="0"/>
+            <wp:wrapThrough wrapText="bothSides">
+              <wp:wrapPolygon edited="0">
+                <wp:start x="0" y="0"/>
+                <wp:lineTo x="0" y="21414"/>
+                <wp:lineTo x="21509" y="21414"/>
+                <wp:lineTo x="21509" y="0"/>
+                <wp:lineTo x="0" y="0"/>
+              </wp:wrapPolygon>
+            </wp:wrapThrough>
+            <wp:docPr id="366377442" name="Resim 1" descr="metin, ekran görüntüsü içeren bir resim&#10;&#10;Yapay zeka tarafından oluşturulmuş içerik yanlış olabilir."/>
+            <wp:cNvGraphicFramePr>
+              <a:graphicFrameLocks xmlns:a="http://schemas.openxmlformats.org/drawingml/2006/main" noChangeAspect="1"/>
+            </wp:cNvGraphicFramePr>
+            <a:graphic xmlns:a="http://schemas.openxmlformats.org/drawingml/2006/main">
+              <a:graphicData uri="http://schemas.openxmlformats.org/drawingml/2006/picture">
+                <pic:pic xmlns:pic="http://schemas.openxmlformats.org/drawingml/2006/picture">
+                  <pic:nvPicPr>
+                    <pic:cNvPr id="366377442" name="Resim 1" descr="metin, ekran görüntüsü içeren bir resim&#10;&#10;Yapay zeka tarafından oluşturulmuş içerik yanlış olabilir."/>
+                    <pic:cNvPicPr/>
+                  </pic:nvPicPr>
+                  <pic:blipFill>
+                    <a:blip r:embed="rId22" cstate="print">
+                      <a:extLst>
+                        <a:ext uri="{28A0092B-C50C-407E-A947-70E740481C1C}">
+                          <a14:useLocalDpi xmlns:a14="http://schemas.microsoft.com/office/drawing/2010/main" val="0"/>
+                        </a:ext>
+                      </a:extLst>
+                    </a:blip>
+                    <a:stretch>
+                      <a:fillRect/>
+                    </a:stretch>
+                  </pic:blipFill>
+                  <pic:spPr>
+                    <a:xfrm>
+                      <a:off x="0" y="0"/>
+                      <a:ext cx="3156585" cy="2363470"/>
+                    </a:xfrm>
+                    <a:prstGeom prst="rect">
+                      <a:avLst/>
+                    </a:prstGeom>
+                  </pic:spPr>
+                </pic:pic>
+              </a:graphicData>
+            </a:graphic>
+            <wp14:sizeRelH relativeFrom="page">
+              <wp14:pctWidth>0</wp14:pctWidth>
+            </wp14:sizeRelH>
+            <wp14:sizeRelV relativeFrom="page">
+              <wp14:pctHeight>0</wp14:pctHeight>
+            </wp14:sizeRelV>
+          </wp:anchor>
+        </w:drawing>
+      </w:r>
+    </w:p>
+    <w:p>
+      <w:pPr>
+        <w:rPr>
+          <w:b/>
+          <w:bCs/>
+          <w:sz w:val="40"/>
+          <w:szCs w:val="40"/>
+        </w:rPr>
+      </w:pPr>
+    </w:p>
+    <w:p>
+      <w:pPr>
+        <w:rPr>
+          <w:b/>
+          <w:bCs/>
+          <w:sz w:val="40"/>
+          <w:szCs w:val="40"/>
+        </w:rPr>
+      </w:pPr>
+      <w:r>
+        <w:rPr>
+          <w:sz w:val="24"/>
+          <w:szCs w:val="24"/>
+        </w:rPr>
+        <w:t>Rezervasyon göndermeden önce 5 şeyi kontrol ediyor: Tarih seçilmiş mi? Gece sayısı geçerli mi? Konuk sayısı geçerli mi? Kapasite aşılmış mı? Kullanıcı giriş yapmış mı? Herhangi biri yanlışsa hata mesajı gösterip durduruyor</w:t>
+      </w:r>
+      <w:r>
+        <w:rPr>
+          <w:sz w:val="24"/>
+          <w:szCs w:val="24"/>
+        </w:rPr>
+        <w:t>.</w:t>
+      </w:r>
+    </w:p>
+    <w:p>
+      <w:pPr>
+        <w:rPr>
+          <w:b/>
+          <w:bCs/>
+          <w:sz w:val="40"/>
+          <w:szCs w:val="40"/>
+        </w:rPr>
+      </w:pPr>
+    </w:p>
+    <w:p>
+      <w:pPr>
+        <w:rPr>
+          <w:b/>
+          <w:bCs/>
+          <w:sz w:val="40"/>
+          <w:szCs w:val="40"/>
+        </w:rPr>
+      </w:pPr>
+    </w:p>
+    <w:p>
+      <w:pPr>
+        <w:rPr>
+          <w:b/>
+          <w:bCs/>
+          <w:sz w:val="40"/>
+          <w:szCs w:val="40"/>
+        </w:rPr>
+      </w:pPr>
+      <w:r>
+        <w:rPr>
+          <w:b/>
+          <w:bCs/>
+          <w:sz w:val="40"/>
+          <w:szCs w:val="40"/>
+        </w:rPr>
+        <w:drawing>
+          <wp:inline distT="0" distB="0" distL="0" distR="0" wp14:anchorId="5912F4CE" wp14:editId="2D148FD6">
+            <wp:extent cx="3143494" cy="3537857"/>
+            <wp:effectExtent l="0" t="0" r="0" b="5715"/>
+            <wp:docPr id="2138617489" name="Resim 1" descr="ağaç, ekran görüntüsü, metin, ev içeren bir resim&#10;&#10;Yapay zeka tarafından oluşturulmuş içerik yanlış olabilir."/>
+            <wp:cNvGraphicFramePr>
+              <a:graphicFrameLocks xmlns:a="http://schemas.openxmlformats.org/drawingml/2006/main" noChangeAspect="1"/>
+            </wp:cNvGraphicFramePr>
+            <a:graphic xmlns:a="http://schemas.openxmlformats.org/drawingml/2006/main">
+              <a:graphicData uri="http://schemas.openxmlformats.org/drawingml/2006/picture">
+                <pic:pic xmlns:pic="http://schemas.openxmlformats.org/drawingml/2006/picture">
+                  <pic:nvPicPr>
+                    <pic:cNvPr id="2138617489" name="Resim 1" descr="ağaç, ekran görüntüsü, metin, ev içeren bir resim&#10;&#10;Yapay zeka tarafından oluşturulmuş içerik yanlış olabilir."/>
+                    <pic:cNvPicPr/>
+                  </pic:nvPicPr>
+                  <pic:blipFill>
+                    <a:blip r:embed="rId23"/>
+                    <a:stretch>
+                      <a:fillRect/>
+                    </a:stretch>
+                  </pic:blipFill>
+                  <pic:spPr>
+                    <a:xfrm>
+                      <a:off x="0" y="0"/>
+                      <a:ext cx="3154754" cy="3550529"/>
+                    </a:xfrm>
+                    <a:prstGeom prst="rect">
+                      <a:avLst/>
+                    </a:prstGeom>
+                  </pic:spPr>
+                </pic:pic>
+              </a:graphicData>
+            </a:graphic>
+          </wp:inline>
+        </w:drawing>
+      </w:r>
+      <w:r>
+        <w:rPr>
+          <w:noProof/>
+        </w:rPr>
+        <w:t xml:space="preserve"> </w:t>
+      </w:r>
+      <w:r>
+        <w:rPr>
+          <w:b/>
+          <w:bCs/>
+          <w:sz w:val="40"/>
+          <w:szCs w:val="40"/>
+        </w:rPr>
+        <w:drawing>
+          <wp:inline distT="0" distB="0" distL="0" distR="0" wp14:anchorId="7978B619" wp14:editId="44D29C87">
+            <wp:extent cx="3124200" cy="3517636"/>
+            <wp:effectExtent l="0" t="0" r="0" b="6985"/>
+            <wp:docPr id="265141530" name="Resim 1" descr="metin, ekran görüntüsü, sayı, numara, yazı tipi içeren bir resim&#10;&#10;Yapay zeka tarafından oluşturulmuş içerik yanlış olabilir."/>
+            <wp:cNvGraphicFramePr>
+              <a:graphicFrameLocks xmlns:a="http://schemas.openxmlformats.org/drawingml/2006/main" noChangeAspect="1"/>
+            </wp:cNvGraphicFramePr>
+            <a:graphic xmlns:a="http://schemas.openxmlformats.org/drawingml/2006/main">
+              <a:graphicData uri="http://schemas.openxmlformats.org/drawingml/2006/picture">
+                <pic:pic xmlns:pic="http://schemas.openxmlformats.org/drawingml/2006/picture">
+                  <pic:nvPicPr>
+                    <pic:cNvPr id="265141530" name="Resim 1" descr="metin, ekran görüntüsü, sayı, numara, yazı tipi içeren bir resim&#10;&#10;Yapay zeka tarafından oluşturulmuş içerik yanlış olabilir."/>
+                    <pic:cNvPicPr/>
+                  </pic:nvPicPr>
+                  <pic:blipFill>
+                    <a:blip r:embed="rId24"/>
+                    <a:stretch>
+                      <a:fillRect/>
+                    </a:stretch>
+                  </pic:blipFill>
+                  <pic:spPr>
+                    <a:xfrm>
+                      <a:off x="0" y="0"/>
+                      <a:ext cx="3138607" cy="3533858"/>
+                    </a:xfrm>
+                    <a:prstGeom prst="rect">
+                      <a:avLst/>
+                    </a:prstGeom>
+                  </pic:spPr>
+                </pic:pic>
+              </a:graphicData>
+            </a:graphic>
+          </wp:inline>
+        </w:drawing>
+      </w:r>
+    </w:p>
+    <w:p>
+      <w:pPr>
+        <w:rPr>
+          <w:b/>
+          <w:bCs/>
+          <w:sz w:val="40"/>
+          <w:szCs w:val="40"/>
+        </w:rPr>
+      </w:pPr>
+    </w:p>
+    <w:p>
+      <w:pPr>
+        <w:rPr>
+          <w:b/>
+          <w:bCs/>
+          <w:sz w:val="40"/>
+          <w:szCs w:val="40"/>
+        </w:rPr>
+      </w:pPr>
+      <w:r>
+        <w:rPr>
+          <w:b/>
+          <w:bCs/>
+          <w:sz w:val="40"/>
+          <w:szCs w:val="40"/>
+        </w:rPr>
+        <w:drawing>
+          <wp:inline distT="0" distB="0" distL="0" distR="0" wp14:anchorId="457A3B92" wp14:editId="033674AB">
+            <wp:extent cx="2710543" cy="2740844"/>
+            <wp:effectExtent l="0" t="0" r="0" b="2540"/>
+            <wp:docPr id="839710992" name="Resim 1" descr="metin, ekran görüntüsü, sayı, numara, yazı tipi içeren bir resim&#10;&#10;Yapay zeka tarafından oluşturulmuş içerik yanlış olabilir."/>
+            <wp:cNvGraphicFramePr>
+              <a:graphicFrameLocks xmlns:a="http://schemas.openxmlformats.org/drawingml/2006/main" noChangeAspect="1"/>
+            </wp:cNvGraphicFramePr>
+            <a:graphic xmlns:a="http://schemas.openxmlformats.org/drawingml/2006/main">
+              <a:graphicData uri="http://schemas.openxmlformats.org/drawingml/2006/picture">
+                <pic:pic xmlns:pic="http://schemas.openxmlformats.org/drawingml/2006/picture">
+                  <pic:nvPicPr>
+                    <pic:cNvPr id="839710992" name="Resim 1" descr="metin, ekran görüntüsü, sayı, numara, yazı tipi içeren bir resim&#10;&#10;Yapay zeka tarafından oluşturulmuş içerik yanlış olabilir."/>
+                    <pic:cNvPicPr/>
+                  </pic:nvPicPr>
+                  <pic:blipFill>
+                    <a:blip r:embed="rId25"/>
+                    <a:stretch>
+                      <a:fillRect/>
+                    </a:stretch>
+                  </pic:blipFill>
+                  <pic:spPr>
+                    <a:xfrm>
+                      <a:off x="0" y="0"/>
+                      <a:ext cx="2751317" cy="2782074"/>
+                    </a:xfrm>
+                    <a:prstGeom prst="rect">
+                      <a:avLst/>
+                    </a:prstGeom>
+                  </pic:spPr>
+                </pic:pic>
+              </a:graphicData>
+            </a:graphic>
+          </wp:inline>
+        </w:drawing>
+      </w:r>
+    </w:p>
+    <w:p>
+      <w:pPr>
+        <w:rPr>
+          <w:b/>
+          <w:bCs/>
+          <w:sz w:val="40"/>
+          <w:szCs w:val="40"/>
+        </w:rPr>
+      </w:pPr>
+      <w:r>
+        <w:rPr>
+          <w:b/>
+          <w:bCs/>
+          <w:sz w:val="40"/>
+          <w:szCs w:val="40"/>
+        </w:rPr>
+        <w:lastRenderedPageBreak/>
+        <w:t xml:space="preserve">Video Linki: </w:t>
+      </w:r>
+      <w:hyperlink r:id="rId26" w:history="1">
+        <w:r>
+          <w:rPr>
+            <w:rStyle w:val="Kpr"/>
+            <w:b/>
+            <w:bCs/>
+            <w:sz w:val="40"/>
+            <w:szCs w:val="40"/>
+          </w:rPr>
+          <w:t>https://youtu.be/vwzzP1_bHC8</w:t>
+        </w:r>
+      </w:hyperlink>
+      <w:r>
+        <w:rPr>
+          <w:b/>
+          <w:bCs/>
+          <w:sz w:val="40"/>
+          <w:szCs w:val="40"/>
+        </w:rPr>
+        <w:t xml:space="preserve">                                </w:t>
+      </w:r>
+      <w:r>
+        <w:t xml:space="preserve"> </w:t>
+      </w:r>
+      <w:r>
+        <w:t xml:space="preserve"> </w:t>
+      </w:r>
+    </w:p>
     <w:sectPr>
       <w:pgSz w:w="11906" w:h="16838"/>
       <w:pgMar w:top="720" w:right="720" w:bottom="720" w:left="720" w:header="708" w:footer="708" w:gutter="0"/>
@@ -3374,6 +4828,155 @@
     </w:lvl>
   </w:abstractNum>
   <w:abstractNum w:abstractNumId="5" w15:restartNumberingAfterBreak="0">
+    <w:nsid w:val="193711F2"/>
+    <w:multiLevelType w:val="multilevel"/>
+    <w:tmpl w:val="235CCDE6"/>
+    <w:lvl w:ilvl="0">
+      <w:start w:val="1"/>
+      <w:numFmt w:val="bullet"/>
+      <w:lvlText w:val=""/>
+      <w:lvlJc w:val="left"/>
+      <w:pPr>
+        <w:tabs>
+          <w:tab w:val="num" w:pos="720"/>
+        </w:tabs>
+        <w:ind w:left="720" w:hanging="360"/>
+      </w:pPr>
+      <w:rPr>
+        <w:rFonts w:ascii="Symbol" w:hAnsi="Symbol" w:hint="default"/>
+        <w:sz w:val="20"/>
+      </w:rPr>
+    </w:lvl>
+    <w:lvl w:ilvl="1" w:tentative="1">
+      <w:start w:val="1"/>
+      <w:numFmt w:val="bullet"/>
+      <w:lvlText w:val="o"/>
+      <w:lvlJc w:val="left"/>
+      <w:pPr>
+        <w:tabs>
+          <w:tab w:val="num" w:pos="1440"/>
+        </w:tabs>
+        <w:ind w:left="1440" w:hanging="360"/>
+      </w:pPr>
+      <w:rPr>
+        <w:rFonts w:ascii="Courier New" w:hAnsi="Courier New" w:hint="default"/>
+        <w:sz w:val="20"/>
+      </w:rPr>
+    </w:lvl>
+    <w:lvl w:ilvl="2" w:tentative="1">
+      <w:start w:val="1"/>
+      <w:numFmt w:val="bullet"/>
+      <w:lvlText w:val=""/>
+      <w:lvlJc w:val="left"/>
+      <w:pPr>
+        <w:tabs>
+          <w:tab w:val="num" w:pos="2160"/>
+        </w:tabs>
+        <w:ind w:left="2160" w:hanging="360"/>
+      </w:pPr>
+      <w:rPr>
+        <w:rFonts w:ascii="Wingdings" w:hAnsi="Wingdings" w:hint="default"/>
+        <w:sz w:val="20"/>
+      </w:rPr>
+    </w:lvl>
+    <w:lvl w:ilvl="3" w:tentative="1">
+      <w:start w:val="1"/>
+      <w:numFmt w:val="bullet"/>
+      <w:lvlText w:val=""/>
+      <w:lvlJc w:val="left"/>
+      <w:pPr>
+        <w:tabs>
+          <w:tab w:val="num" w:pos="2880"/>
+        </w:tabs>
+        <w:ind w:left="2880" w:hanging="360"/>
+      </w:pPr>
+      <w:rPr>
+        <w:rFonts w:ascii="Wingdings" w:hAnsi="Wingdings" w:hint="default"/>
+        <w:sz w:val="20"/>
+      </w:rPr>
+    </w:lvl>
+    <w:lvl w:ilvl="4" w:tentative="1">
+      <w:start w:val="1"/>
+      <w:numFmt w:val="bullet"/>
+      <w:lvlText w:val=""/>
+      <w:lvlJc w:val="left"/>
+      <w:pPr>
+        <w:tabs>
+          <w:tab w:val="num" w:pos="3600"/>
+        </w:tabs>
+        <w:ind w:left="3600" w:hanging="360"/>
+      </w:pPr>
+      <w:rPr>
+        <w:rFonts w:ascii="Wingdings" w:hAnsi="Wingdings" w:hint="default"/>
+        <w:sz w:val="20"/>
+      </w:rPr>
+    </w:lvl>
+    <w:lvl w:ilvl="5" w:tentative="1">
+      <w:start w:val="1"/>
+      <w:numFmt w:val="bullet"/>
+      <w:lvlText w:val=""/>
+      <w:lvlJc w:val="left"/>
+      <w:pPr>
+        <w:tabs>
+          <w:tab w:val="num" w:pos="4320"/>
+        </w:tabs>
+        <w:ind w:left="4320" w:hanging="360"/>
+      </w:pPr>
+      <w:rPr>
+        <w:rFonts w:ascii="Wingdings" w:hAnsi="Wingdings" w:hint="default"/>
+        <w:sz w:val="20"/>
+      </w:rPr>
+    </w:lvl>
+    <w:lvl w:ilvl="6" w:tentative="1">
+      <w:start w:val="1"/>
+      <w:numFmt w:val="bullet"/>
+      <w:lvlText w:val=""/>
+      <w:lvlJc w:val="left"/>
+      <w:pPr>
+        <w:tabs>
+          <w:tab w:val="num" w:pos="5040"/>
+        </w:tabs>
+        <w:ind w:left="5040" w:hanging="360"/>
+      </w:pPr>
+      <w:rPr>
+        <w:rFonts w:ascii="Wingdings" w:hAnsi="Wingdings" w:hint="default"/>
+        <w:sz w:val="20"/>
+      </w:rPr>
+    </w:lvl>
+    <w:lvl w:ilvl="7" w:tentative="1">
+      <w:start w:val="1"/>
+      <w:numFmt w:val="bullet"/>
+      <w:lvlText w:val=""/>
+      <w:lvlJc w:val="left"/>
+      <w:pPr>
+        <w:tabs>
+          <w:tab w:val="num" w:pos="5760"/>
+        </w:tabs>
+        <w:ind w:left="5760" w:hanging="360"/>
+      </w:pPr>
+      <w:rPr>
+        <w:rFonts w:ascii="Wingdings" w:hAnsi="Wingdings" w:hint="default"/>
+        <w:sz w:val="20"/>
+      </w:rPr>
+    </w:lvl>
+    <w:lvl w:ilvl="8" w:tentative="1">
+      <w:start w:val="1"/>
+      <w:numFmt w:val="bullet"/>
+      <w:lvlText w:val=""/>
+      <w:lvlJc w:val="left"/>
+      <w:pPr>
+        <w:tabs>
+          <w:tab w:val="num" w:pos="6480"/>
+        </w:tabs>
+        <w:ind w:left="6480" w:hanging="360"/>
+      </w:pPr>
+      <w:rPr>
+        <w:rFonts w:ascii="Wingdings" w:hAnsi="Wingdings" w:hint="default"/>
+        <w:sz w:val="20"/>
+      </w:rPr>
+    </w:lvl>
+  </w:abstractNum>
+  <w:abstractNum w:abstractNumId="6" w15:restartNumberingAfterBreak="0">
     <w:nsid w:val="1D32405E"/>
     <w:multiLevelType w:val="hybridMultilevel"/>
     <w:tmpl w:val="9E02595C"/>
@@ -3463,7 +5066,305 @@
       </w:pPr>
     </w:lvl>
   </w:abstractNum>
-  <w:abstractNum w:abstractNumId="6" w15:restartNumberingAfterBreak="0">
+  <w:abstractNum w:abstractNumId="7" w15:restartNumberingAfterBreak="0">
+    <w:nsid w:val="222A593B"/>
+    <w:multiLevelType w:val="multilevel"/>
+    <w:tmpl w:val="DEB69C7C"/>
+    <w:lvl w:ilvl="0">
+      <w:start w:val="1"/>
+      <w:numFmt w:val="bullet"/>
+      <w:lvlText w:val=""/>
+      <w:lvlJc w:val="left"/>
+      <w:pPr>
+        <w:tabs>
+          <w:tab w:val="num" w:pos="720"/>
+        </w:tabs>
+        <w:ind w:left="720" w:hanging="360"/>
+      </w:pPr>
+      <w:rPr>
+        <w:rFonts w:ascii="Symbol" w:hAnsi="Symbol" w:hint="default"/>
+        <w:sz w:val="20"/>
+      </w:rPr>
+    </w:lvl>
+    <w:lvl w:ilvl="1" w:tentative="1">
+      <w:start w:val="1"/>
+      <w:numFmt w:val="bullet"/>
+      <w:lvlText w:val="o"/>
+      <w:lvlJc w:val="left"/>
+      <w:pPr>
+        <w:tabs>
+          <w:tab w:val="num" w:pos="1440"/>
+        </w:tabs>
+        <w:ind w:left="1440" w:hanging="360"/>
+      </w:pPr>
+      <w:rPr>
+        <w:rFonts w:ascii="Courier New" w:hAnsi="Courier New" w:hint="default"/>
+        <w:sz w:val="20"/>
+      </w:rPr>
+    </w:lvl>
+    <w:lvl w:ilvl="2" w:tentative="1">
+      <w:start w:val="1"/>
+      <w:numFmt w:val="bullet"/>
+      <w:lvlText w:val=""/>
+      <w:lvlJc w:val="left"/>
+      <w:pPr>
+        <w:tabs>
+          <w:tab w:val="num" w:pos="2160"/>
+        </w:tabs>
+        <w:ind w:left="2160" w:hanging="360"/>
+      </w:pPr>
+      <w:rPr>
+        <w:rFonts w:ascii="Wingdings" w:hAnsi="Wingdings" w:hint="default"/>
+        <w:sz w:val="20"/>
+      </w:rPr>
+    </w:lvl>
+    <w:lvl w:ilvl="3" w:tentative="1">
+      <w:start w:val="1"/>
+      <w:numFmt w:val="bullet"/>
+      <w:lvlText w:val=""/>
+      <w:lvlJc w:val="left"/>
+      <w:pPr>
+        <w:tabs>
+          <w:tab w:val="num" w:pos="2880"/>
+        </w:tabs>
+        <w:ind w:left="2880" w:hanging="360"/>
+      </w:pPr>
+      <w:rPr>
+        <w:rFonts w:ascii="Wingdings" w:hAnsi="Wingdings" w:hint="default"/>
+        <w:sz w:val="20"/>
+      </w:rPr>
+    </w:lvl>
+    <w:lvl w:ilvl="4" w:tentative="1">
+      <w:start w:val="1"/>
+      <w:numFmt w:val="bullet"/>
+      <w:lvlText w:val=""/>
+      <w:lvlJc w:val="left"/>
+      <w:pPr>
+        <w:tabs>
+          <w:tab w:val="num" w:pos="3600"/>
+        </w:tabs>
+        <w:ind w:left="3600" w:hanging="360"/>
+      </w:pPr>
+      <w:rPr>
+        <w:rFonts w:ascii="Wingdings" w:hAnsi="Wingdings" w:hint="default"/>
+        <w:sz w:val="20"/>
+      </w:rPr>
+    </w:lvl>
+    <w:lvl w:ilvl="5" w:tentative="1">
+      <w:start w:val="1"/>
+      <w:numFmt w:val="bullet"/>
+      <w:lvlText w:val=""/>
+      <w:lvlJc w:val="left"/>
+      <w:pPr>
+        <w:tabs>
+          <w:tab w:val="num" w:pos="4320"/>
+        </w:tabs>
+        <w:ind w:left="4320" w:hanging="360"/>
+      </w:pPr>
+      <w:rPr>
+        <w:rFonts w:ascii="Wingdings" w:hAnsi="Wingdings" w:hint="default"/>
+        <w:sz w:val="20"/>
+      </w:rPr>
+    </w:lvl>
+    <w:lvl w:ilvl="6" w:tentative="1">
+      <w:start w:val="1"/>
+      <w:numFmt w:val="bullet"/>
+      <w:lvlText w:val=""/>
+      <w:lvlJc w:val="left"/>
+      <w:pPr>
+        <w:tabs>
+          <w:tab w:val="num" w:pos="5040"/>
+        </w:tabs>
+        <w:ind w:left="5040" w:hanging="360"/>
+      </w:pPr>
+      <w:rPr>
+        <w:rFonts w:ascii="Wingdings" w:hAnsi="Wingdings" w:hint="default"/>
+        <w:sz w:val="20"/>
+      </w:rPr>
+    </w:lvl>
+    <w:lvl w:ilvl="7" w:tentative="1">
+      <w:start w:val="1"/>
+      <w:numFmt w:val="bullet"/>
+      <w:lvlText w:val=""/>
+      <w:lvlJc w:val="left"/>
+      <w:pPr>
+        <w:tabs>
+          <w:tab w:val="num" w:pos="5760"/>
+        </w:tabs>
+        <w:ind w:left="5760" w:hanging="360"/>
+      </w:pPr>
+      <w:rPr>
+        <w:rFonts w:ascii="Wingdings" w:hAnsi="Wingdings" w:hint="default"/>
+        <w:sz w:val="20"/>
+      </w:rPr>
+    </w:lvl>
+    <w:lvl w:ilvl="8" w:tentative="1">
+      <w:start w:val="1"/>
+      <w:numFmt w:val="bullet"/>
+      <w:lvlText w:val=""/>
+      <w:lvlJc w:val="left"/>
+      <w:pPr>
+        <w:tabs>
+          <w:tab w:val="num" w:pos="6480"/>
+        </w:tabs>
+        <w:ind w:left="6480" w:hanging="360"/>
+      </w:pPr>
+      <w:rPr>
+        <w:rFonts w:ascii="Wingdings" w:hAnsi="Wingdings" w:hint="default"/>
+        <w:sz w:val="20"/>
+      </w:rPr>
+    </w:lvl>
+  </w:abstractNum>
+  <w:abstractNum w:abstractNumId="8" w15:restartNumberingAfterBreak="0">
+    <w:nsid w:val="42296991"/>
+    <w:multiLevelType w:val="multilevel"/>
+    <w:tmpl w:val="4F12CAA8"/>
+    <w:lvl w:ilvl="0">
+      <w:start w:val="1"/>
+      <w:numFmt w:val="bullet"/>
+      <w:lvlText w:val=""/>
+      <w:lvlJc w:val="left"/>
+      <w:pPr>
+        <w:tabs>
+          <w:tab w:val="num" w:pos="720"/>
+        </w:tabs>
+        <w:ind w:left="720" w:hanging="360"/>
+      </w:pPr>
+      <w:rPr>
+        <w:rFonts w:ascii="Symbol" w:hAnsi="Symbol" w:hint="default"/>
+        <w:sz w:val="20"/>
+      </w:rPr>
+    </w:lvl>
+    <w:lvl w:ilvl="1" w:tentative="1">
+      <w:start w:val="1"/>
+      <w:numFmt w:val="bullet"/>
+      <w:lvlText w:val="o"/>
+      <w:lvlJc w:val="left"/>
+      <w:pPr>
+        <w:tabs>
+          <w:tab w:val="num" w:pos="1440"/>
+        </w:tabs>
+        <w:ind w:left="1440" w:hanging="360"/>
+      </w:pPr>
+      <w:rPr>
+        <w:rFonts w:ascii="Courier New" w:hAnsi="Courier New" w:hint="default"/>
+        <w:sz w:val="20"/>
+      </w:rPr>
+    </w:lvl>
+    <w:lvl w:ilvl="2" w:tentative="1">
+      <w:start w:val="1"/>
+      <w:numFmt w:val="bullet"/>
+      <w:lvlText w:val=""/>
+      <w:lvlJc w:val="left"/>
+      <w:pPr>
+        <w:tabs>
+          <w:tab w:val="num" w:pos="2160"/>
+        </w:tabs>
+        <w:ind w:left="2160" w:hanging="360"/>
+      </w:pPr>
+      <w:rPr>
+        <w:rFonts w:ascii="Wingdings" w:hAnsi="Wingdings" w:hint="default"/>
+        <w:sz w:val="20"/>
+      </w:rPr>
+    </w:lvl>
+    <w:lvl w:ilvl="3" w:tentative="1">
+      <w:start w:val="1"/>
+      <w:numFmt w:val="bullet"/>
+      <w:lvlText w:val=""/>
+      <w:lvlJc w:val="left"/>
+      <w:pPr>
+        <w:tabs>
+          <w:tab w:val="num" w:pos="2880"/>
+        </w:tabs>
+        <w:ind w:left="2880" w:hanging="360"/>
+      </w:pPr>
+      <w:rPr>
+        <w:rFonts w:ascii="Wingdings" w:hAnsi="Wingdings" w:hint="default"/>
+        <w:sz w:val="20"/>
+      </w:rPr>
+    </w:lvl>
+    <w:lvl w:ilvl="4" w:tentative="1">
+      <w:start w:val="1"/>
+      <w:numFmt w:val="bullet"/>
+      <w:lvlText w:val=""/>
+      <w:lvlJc w:val="left"/>
+      <w:pPr>
+        <w:tabs>
+          <w:tab w:val="num" w:pos="3600"/>
+        </w:tabs>
+        <w:ind w:left="3600" w:hanging="360"/>
+      </w:pPr>
+      <w:rPr>
+        <w:rFonts w:ascii="Wingdings" w:hAnsi="Wingdings" w:hint="default"/>
+        <w:sz w:val="20"/>
+      </w:rPr>
+    </w:lvl>
+    <w:lvl w:ilvl="5" w:tentative="1">
+      <w:start w:val="1"/>
+      <w:numFmt w:val="bullet"/>
+      <w:lvlText w:val=""/>
+      <w:lvlJc w:val="left"/>
+      <w:pPr>
+        <w:tabs>
+          <w:tab w:val="num" w:pos="4320"/>
+        </w:tabs>
+        <w:ind w:left="4320" w:hanging="360"/>
+      </w:pPr>
+      <w:rPr>
+        <w:rFonts w:ascii="Wingdings" w:hAnsi="Wingdings" w:hint="default"/>
+        <w:sz w:val="20"/>
+      </w:rPr>
+    </w:lvl>
+    <w:lvl w:ilvl="6" w:tentative="1">
+      <w:start w:val="1"/>
+      <w:numFmt w:val="bullet"/>
+      <w:lvlText w:val=""/>
+      <w:lvlJc w:val="left"/>
+      <w:pPr>
+        <w:tabs>
+          <w:tab w:val="num" w:pos="5040"/>
+        </w:tabs>
+        <w:ind w:left="5040" w:hanging="360"/>
+      </w:pPr>
+      <w:rPr>
+        <w:rFonts w:ascii="Wingdings" w:hAnsi="Wingdings" w:hint="default"/>
+        <w:sz w:val="20"/>
+      </w:rPr>
+    </w:lvl>
+    <w:lvl w:ilvl="7" w:tentative="1">
+      <w:start w:val="1"/>
+      <w:numFmt w:val="bullet"/>
+      <w:lvlText w:val=""/>
+      <w:lvlJc w:val="left"/>
+      <w:pPr>
+        <w:tabs>
+          <w:tab w:val="num" w:pos="5760"/>
+        </w:tabs>
+        <w:ind w:left="5760" w:hanging="360"/>
+      </w:pPr>
+      <w:rPr>
+        <w:rFonts w:ascii="Wingdings" w:hAnsi="Wingdings" w:hint="default"/>
+        <w:sz w:val="20"/>
+      </w:rPr>
+    </w:lvl>
+    <w:lvl w:ilvl="8" w:tentative="1">
+      <w:start w:val="1"/>
+      <w:numFmt w:val="bullet"/>
+      <w:lvlText w:val=""/>
+      <w:lvlJc w:val="left"/>
+      <w:pPr>
+        <w:tabs>
+          <w:tab w:val="num" w:pos="6480"/>
+        </w:tabs>
+        <w:ind w:left="6480" w:hanging="360"/>
+      </w:pPr>
+      <w:rPr>
+        <w:rFonts w:ascii="Wingdings" w:hAnsi="Wingdings" w:hint="default"/>
+        <w:sz w:val="20"/>
+      </w:rPr>
+    </w:lvl>
+  </w:abstractNum>
+  <w:abstractNum w:abstractNumId="9" w15:restartNumberingAfterBreak="0">
     <w:nsid w:val="427301F0"/>
     <w:multiLevelType w:val="multilevel"/>
     <w:tmpl w:val="0D2A589A"/>
@@ -3612,7 +5513,7 @@
       </w:rPr>
     </w:lvl>
   </w:abstractNum>
-  <w:abstractNum w:abstractNumId="7" w15:restartNumberingAfterBreak="0">
+  <w:abstractNum w:abstractNumId="10" w15:restartNumberingAfterBreak="0">
     <w:nsid w:val="45AE6334"/>
     <w:multiLevelType w:val="multilevel"/>
     <w:tmpl w:val="297CF0EC"/>
@@ -3761,7 +5662,7 @@
       </w:rPr>
     </w:lvl>
   </w:abstractNum>
-  <w:abstractNum w:abstractNumId="8" w15:restartNumberingAfterBreak="0">
+  <w:abstractNum w:abstractNumId="11" w15:restartNumberingAfterBreak="0">
     <w:nsid w:val="501156EE"/>
     <w:multiLevelType w:val="hybridMultilevel"/>
     <w:tmpl w:val="33D84E90"/>
@@ -3851,7 +5752,7 @@
       </w:pPr>
     </w:lvl>
   </w:abstractNum>
-  <w:abstractNum w:abstractNumId="9" w15:restartNumberingAfterBreak="0">
+  <w:abstractNum w:abstractNumId="12" w15:restartNumberingAfterBreak="0">
     <w:nsid w:val="560B36BC"/>
     <w:multiLevelType w:val="multilevel"/>
     <w:tmpl w:val="EDB857C2"/>
@@ -4000,7 +5901,7 @@
       </w:rPr>
     </w:lvl>
   </w:abstractNum>
-  <w:abstractNum w:abstractNumId="10" w15:restartNumberingAfterBreak="0">
+  <w:abstractNum w:abstractNumId="13" w15:restartNumberingAfterBreak="0">
     <w:nsid w:val="59FF5E98"/>
     <w:multiLevelType w:val="multilevel"/>
     <w:tmpl w:val="5964E98A"/>
@@ -4149,7 +6050,7 @@
       </w:rPr>
     </w:lvl>
   </w:abstractNum>
-  <w:abstractNum w:abstractNumId="11" w15:restartNumberingAfterBreak="0">
+  <w:abstractNum w:abstractNumId="14" w15:restartNumberingAfterBreak="0">
     <w:nsid w:val="5A9F4916"/>
     <w:multiLevelType w:val="multilevel"/>
     <w:tmpl w:val="4C860BBE"/>
@@ -4298,7 +6199,305 @@
       </w:rPr>
     </w:lvl>
   </w:abstractNum>
-  <w:abstractNum w:abstractNumId="12" w15:restartNumberingAfterBreak="0">
+  <w:abstractNum w:abstractNumId="15" w15:restartNumberingAfterBreak="0">
+    <w:nsid w:val="5C5F63EA"/>
+    <w:multiLevelType w:val="multilevel"/>
+    <w:tmpl w:val="C27CC192"/>
+    <w:lvl w:ilvl="0">
+      <w:start w:val="1"/>
+      <w:numFmt w:val="bullet"/>
+      <w:lvlText w:val=""/>
+      <w:lvlJc w:val="left"/>
+      <w:pPr>
+        <w:tabs>
+          <w:tab w:val="num" w:pos="720"/>
+        </w:tabs>
+        <w:ind w:left="720" w:hanging="360"/>
+      </w:pPr>
+      <w:rPr>
+        <w:rFonts w:ascii="Symbol" w:hAnsi="Symbol" w:hint="default"/>
+        <w:sz w:val="20"/>
+      </w:rPr>
+    </w:lvl>
+    <w:lvl w:ilvl="1">
+      <w:start w:val="1"/>
+      <w:numFmt w:val="bullet"/>
+      <w:lvlText w:val="o"/>
+      <w:lvlJc w:val="left"/>
+      <w:pPr>
+        <w:tabs>
+          <w:tab w:val="num" w:pos="1440"/>
+        </w:tabs>
+        <w:ind w:left="1440" w:hanging="360"/>
+      </w:pPr>
+      <w:rPr>
+        <w:rFonts w:ascii="Courier New" w:hAnsi="Courier New" w:hint="default"/>
+        <w:sz w:val="20"/>
+      </w:rPr>
+    </w:lvl>
+    <w:lvl w:ilvl="2" w:tentative="1">
+      <w:start w:val="1"/>
+      <w:numFmt w:val="bullet"/>
+      <w:lvlText w:val=""/>
+      <w:lvlJc w:val="left"/>
+      <w:pPr>
+        <w:tabs>
+          <w:tab w:val="num" w:pos="2160"/>
+        </w:tabs>
+        <w:ind w:left="2160" w:hanging="360"/>
+      </w:pPr>
+      <w:rPr>
+        <w:rFonts w:ascii="Wingdings" w:hAnsi="Wingdings" w:hint="default"/>
+        <w:sz w:val="20"/>
+      </w:rPr>
+    </w:lvl>
+    <w:lvl w:ilvl="3" w:tentative="1">
+      <w:start w:val="1"/>
+      <w:numFmt w:val="bullet"/>
+      <w:lvlText w:val=""/>
+      <w:lvlJc w:val="left"/>
+      <w:pPr>
+        <w:tabs>
+          <w:tab w:val="num" w:pos="2880"/>
+        </w:tabs>
+        <w:ind w:left="2880" w:hanging="360"/>
+      </w:pPr>
+      <w:rPr>
+        <w:rFonts w:ascii="Wingdings" w:hAnsi="Wingdings" w:hint="default"/>
+        <w:sz w:val="20"/>
+      </w:rPr>
+    </w:lvl>
+    <w:lvl w:ilvl="4" w:tentative="1">
+      <w:start w:val="1"/>
+      <w:numFmt w:val="bullet"/>
+      <w:lvlText w:val=""/>
+      <w:lvlJc w:val="left"/>
+      <w:pPr>
+        <w:tabs>
+          <w:tab w:val="num" w:pos="3600"/>
+        </w:tabs>
+        <w:ind w:left="3600" w:hanging="360"/>
+      </w:pPr>
+      <w:rPr>
+        <w:rFonts w:ascii="Wingdings" w:hAnsi="Wingdings" w:hint="default"/>
+        <w:sz w:val="20"/>
+      </w:rPr>
+    </w:lvl>
+    <w:lvl w:ilvl="5" w:tentative="1">
+      <w:start w:val="1"/>
+      <w:numFmt w:val="bullet"/>
+      <w:lvlText w:val=""/>
+      <w:lvlJc w:val="left"/>
+      <w:pPr>
+        <w:tabs>
+          <w:tab w:val="num" w:pos="4320"/>
+        </w:tabs>
+        <w:ind w:left="4320" w:hanging="360"/>
+      </w:pPr>
+      <w:rPr>
+        <w:rFonts w:ascii="Wingdings" w:hAnsi="Wingdings" w:hint="default"/>
+        <w:sz w:val="20"/>
+      </w:rPr>
+    </w:lvl>
+    <w:lvl w:ilvl="6" w:tentative="1">
+      <w:start w:val="1"/>
+      <w:numFmt w:val="bullet"/>
+      <w:lvlText w:val=""/>
+      <w:lvlJc w:val="left"/>
+      <w:pPr>
+        <w:tabs>
+          <w:tab w:val="num" w:pos="5040"/>
+        </w:tabs>
+        <w:ind w:left="5040" w:hanging="360"/>
+      </w:pPr>
+      <w:rPr>
+        <w:rFonts w:ascii="Wingdings" w:hAnsi="Wingdings" w:hint="default"/>
+        <w:sz w:val="20"/>
+      </w:rPr>
+    </w:lvl>
+    <w:lvl w:ilvl="7" w:tentative="1">
+      <w:start w:val="1"/>
+      <w:numFmt w:val="bullet"/>
+      <w:lvlText w:val=""/>
+      <w:lvlJc w:val="left"/>
+      <w:pPr>
+        <w:tabs>
+          <w:tab w:val="num" w:pos="5760"/>
+        </w:tabs>
+        <w:ind w:left="5760" w:hanging="360"/>
+      </w:pPr>
+      <w:rPr>
+        <w:rFonts w:ascii="Wingdings" w:hAnsi="Wingdings" w:hint="default"/>
+        <w:sz w:val="20"/>
+      </w:rPr>
+    </w:lvl>
+    <w:lvl w:ilvl="8" w:tentative="1">
+      <w:start w:val="1"/>
+      <w:numFmt w:val="bullet"/>
+      <w:lvlText w:val=""/>
+      <w:lvlJc w:val="left"/>
+      <w:pPr>
+        <w:tabs>
+          <w:tab w:val="num" w:pos="6480"/>
+        </w:tabs>
+        <w:ind w:left="6480" w:hanging="360"/>
+      </w:pPr>
+      <w:rPr>
+        <w:rFonts w:ascii="Wingdings" w:hAnsi="Wingdings" w:hint="default"/>
+        <w:sz w:val="20"/>
+      </w:rPr>
+    </w:lvl>
+  </w:abstractNum>
+  <w:abstractNum w:abstractNumId="16" w15:restartNumberingAfterBreak="0">
+    <w:nsid w:val="6ACB4DA9"/>
+    <w:multiLevelType w:val="multilevel"/>
+    <w:tmpl w:val="3FFCF934"/>
+    <w:lvl w:ilvl="0">
+      <w:start w:val="1"/>
+      <w:numFmt w:val="bullet"/>
+      <w:lvlText w:val=""/>
+      <w:lvlJc w:val="left"/>
+      <w:pPr>
+        <w:tabs>
+          <w:tab w:val="num" w:pos="720"/>
+        </w:tabs>
+        <w:ind w:left="720" w:hanging="360"/>
+      </w:pPr>
+      <w:rPr>
+        <w:rFonts w:ascii="Symbol" w:hAnsi="Symbol" w:hint="default"/>
+        <w:sz w:val="20"/>
+      </w:rPr>
+    </w:lvl>
+    <w:lvl w:ilvl="1" w:tentative="1">
+      <w:start w:val="1"/>
+      <w:numFmt w:val="bullet"/>
+      <w:lvlText w:val="o"/>
+      <w:lvlJc w:val="left"/>
+      <w:pPr>
+        <w:tabs>
+          <w:tab w:val="num" w:pos="1440"/>
+        </w:tabs>
+        <w:ind w:left="1440" w:hanging="360"/>
+      </w:pPr>
+      <w:rPr>
+        <w:rFonts w:ascii="Courier New" w:hAnsi="Courier New" w:hint="default"/>
+        <w:sz w:val="20"/>
+      </w:rPr>
+    </w:lvl>
+    <w:lvl w:ilvl="2" w:tentative="1">
+      <w:start w:val="1"/>
+      <w:numFmt w:val="bullet"/>
+      <w:lvlText w:val=""/>
+      <w:lvlJc w:val="left"/>
+      <w:pPr>
+        <w:tabs>
+          <w:tab w:val="num" w:pos="2160"/>
+        </w:tabs>
+        <w:ind w:left="2160" w:hanging="360"/>
+      </w:pPr>
+      <w:rPr>
+        <w:rFonts w:ascii="Wingdings" w:hAnsi="Wingdings" w:hint="default"/>
+        <w:sz w:val="20"/>
+      </w:rPr>
+    </w:lvl>
+    <w:lvl w:ilvl="3" w:tentative="1">
+      <w:start w:val="1"/>
+      <w:numFmt w:val="bullet"/>
+      <w:lvlText w:val=""/>
+      <w:lvlJc w:val="left"/>
+      <w:pPr>
+        <w:tabs>
+          <w:tab w:val="num" w:pos="2880"/>
+        </w:tabs>
+        <w:ind w:left="2880" w:hanging="360"/>
+      </w:pPr>
+      <w:rPr>
+        <w:rFonts w:ascii="Wingdings" w:hAnsi="Wingdings" w:hint="default"/>
+        <w:sz w:val="20"/>
+      </w:rPr>
+    </w:lvl>
+    <w:lvl w:ilvl="4" w:tentative="1">
+      <w:start w:val="1"/>
+      <w:numFmt w:val="bullet"/>
+      <w:lvlText w:val=""/>
+      <w:lvlJc w:val="left"/>
+      <w:pPr>
+        <w:tabs>
+          <w:tab w:val="num" w:pos="3600"/>
+        </w:tabs>
+        <w:ind w:left="3600" w:hanging="360"/>
+      </w:pPr>
+      <w:rPr>
+        <w:rFonts w:ascii="Wingdings" w:hAnsi="Wingdings" w:hint="default"/>
+        <w:sz w:val="20"/>
+      </w:rPr>
+    </w:lvl>
+    <w:lvl w:ilvl="5" w:tentative="1">
+      <w:start w:val="1"/>
+      <w:numFmt w:val="bullet"/>
+      <w:lvlText w:val=""/>
+      <w:lvlJc w:val="left"/>
+      <w:pPr>
+        <w:tabs>
+          <w:tab w:val="num" w:pos="4320"/>
+        </w:tabs>
+        <w:ind w:left="4320" w:hanging="360"/>
+      </w:pPr>
+      <w:rPr>
+        <w:rFonts w:ascii="Wingdings" w:hAnsi="Wingdings" w:hint="default"/>
+        <w:sz w:val="20"/>
+      </w:rPr>
+    </w:lvl>
+    <w:lvl w:ilvl="6" w:tentative="1">
+      <w:start w:val="1"/>
+      <w:numFmt w:val="bullet"/>
+      <w:lvlText w:val=""/>
+      <w:lvlJc w:val="left"/>
+      <w:pPr>
+        <w:tabs>
+          <w:tab w:val="num" w:pos="5040"/>
+        </w:tabs>
+        <w:ind w:left="5040" w:hanging="360"/>
+      </w:pPr>
+      <w:rPr>
+        <w:rFonts w:ascii="Wingdings" w:hAnsi="Wingdings" w:hint="default"/>
+        <w:sz w:val="20"/>
+      </w:rPr>
+    </w:lvl>
+    <w:lvl w:ilvl="7" w:tentative="1">
+      <w:start w:val="1"/>
+      <w:numFmt w:val="bullet"/>
+      <w:lvlText w:val=""/>
+      <w:lvlJc w:val="left"/>
+      <w:pPr>
+        <w:tabs>
+          <w:tab w:val="num" w:pos="5760"/>
+        </w:tabs>
+        <w:ind w:left="5760" w:hanging="360"/>
+      </w:pPr>
+      <w:rPr>
+        <w:rFonts w:ascii="Wingdings" w:hAnsi="Wingdings" w:hint="default"/>
+        <w:sz w:val="20"/>
+      </w:rPr>
+    </w:lvl>
+    <w:lvl w:ilvl="8" w:tentative="1">
+      <w:start w:val="1"/>
+      <w:numFmt w:val="bullet"/>
+      <w:lvlText w:val=""/>
+      <w:lvlJc w:val="left"/>
+      <w:pPr>
+        <w:tabs>
+          <w:tab w:val="num" w:pos="6480"/>
+        </w:tabs>
+        <w:ind w:left="6480" w:hanging="360"/>
+      </w:pPr>
+      <w:rPr>
+        <w:rFonts w:ascii="Wingdings" w:hAnsi="Wingdings" w:hint="default"/>
+        <w:sz w:val="20"/>
+      </w:rPr>
+    </w:lvl>
+  </w:abstractNum>
+  <w:abstractNum w:abstractNumId="17" w15:restartNumberingAfterBreak="0">
     <w:nsid w:val="6BA32602"/>
     <w:multiLevelType w:val="multilevel"/>
     <w:tmpl w:val="84BEE512"/>
@@ -4447,7 +6646,305 @@
       </w:rPr>
     </w:lvl>
   </w:abstractNum>
-  <w:abstractNum w:abstractNumId="13" w15:restartNumberingAfterBreak="0">
+  <w:abstractNum w:abstractNumId="18" w15:restartNumberingAfterBreak="0">
+    <w:nsid w:val="7272505D"/>
+    <w:multiLevelType w:val="multilevel"/>
+    <w:tmpl w:val="78003E54"/>
+    <w:lvl w:ilvl="0">
+      <w:start w:val="1"/>
+      <w:numFmt w:val="bullet"/>
+      <w:lvlText w:val=""/>
+      <w:lvlJc w:val="left"/>
+      <w:pPr>
+        <w:tabs>
+          <w:tab w:val="num" w:pos="720"/>
+        </w:tabs>
+        <w:ind w:left="720" w:hanging="360"/>
+      </w:pPr>
+      <w:rPr>
+        <w:rFonts w:ascii="Symbol" w:hAnsi="Symbol" w:hint="default"/>
+        <w:sz w:val="20"/>
+      </w:rPr>
+    </w:lvl>
+    <w:lvl w:ilvl="1" w:tentative="1">
+      <w:start w:val="1"/>
+      <w:numFmt w:val="bullet"/>
+      <w:lvlText w:val="o"/>
+      <w:lvlJc w:val="left"/>
+      <w:pPr>
+        <w:tabs>
+          <w:tab w:val="num" w:pos="1440"/>
+        </w:tabs>
+        <w:ind w:left="1440" w:hanging="360"/>
+      </w:pPr>
+      <w:rPr>
+        <w:rFonts w:ascii="Courier New" w:hAnsi="Courier New" w:hint="default"/>
+        <w:sz w:val="20"/>
+      </w:rPr>
+    </w:lvl>
+    <w:lvl w:ilvl="2" w:tentative="1">
+      <w:start w:val="1"/>
+      <w:numFmt w:val="bullet"/>
+      <w:lvlText w:val=""/>
+      <w:lvlJc w:val="left"/>
+      <w:pPr>
+        <w:tabs>
+          <w:tab w:val="num" w:pos="2160"/>
+        </w:tabs>
+        <w:ind w:left="2160" w:hanging="360"/>
+      </w:pPr>
+      <w:rPr>
+        <w:rFonts w:ascii="Wingdings" w:hAnsi="Wingdings" w:hint="default"/>
+        <w:sz w:val="20"/>
+      </w:rPr>
+    </w:lvl>
+    <w:lvl w:ilvl="3" w:tentative="1">
+      <w:start w:val="1"/>
+      <w:numFmt w:val="bullet"/>
+      <w:lvlText w:val=""/>
+      <w:lvlJc w:val="left"/>
+      <w:pPr>
+        <w:tabs>
+          <w:tab w:val="num" w:pos="2880"/>
+        </w:tabs>
+        <w:ind w:left="2880" w:hanging="360"/>
+      </w:pPr>
+      <w:rPr>
+        <w:rFonts w:ascii="Wingdings" w:hAnsi="Wingdings" w:hint="default"/>
+        <w:sz w:val="20"/>
+      </w:rPr>
+    </w:lvl>
+    <w:lvl w:ilvl="4" w:tentative="1">
+      <w:start w:val="1"/>
+      <w:numFmt w:val="bullet"/>
+      <w:lvlText w:val=""/>
+      <w:lvlJc w:val="left"/>
+      <w:pPr>
+        <w:tabs>
+          <w:tab w:val="num" w:pos="3600"/>
+        </w:tabs>
+        <w:ind w:left="3600" w:hanging="360"/>
+      </w:pPr>
+      <w:rPr>
+        <w:rFonts w:ascii="Wingdings" w:hAnsi="Wingdings" w:hint="default"/>
+        <w:sz w:val="20"/>
+      </w:rPr>
+    </w:lvl>
+    <w:lvl w:ilvl="5" w:tentative="1">
+      <w:start w:val="1"/>
+      <w:numFmt w:val="bullet"/>
+      <w:lvlText w:val=""/>
+      <w:lvlJc w:val="left"/>
+      <w:pPr>
+        <w:tabs>
+          <w:tab w:val="num" w:pos="4320"/>
+        </w:tabs>
+        <w:ind w:left="4320" w:hanging="360"/>
+      </w:pPr>
+      <w:rPr>
+        <w:rFonts w:ascii="Wingdings" w:hAnsi="Wingdings" w:hint="default"/>
+        <w:sz w:val="20"/>
+      </w:rPr>
+    </w:lvl>
+    <w:lvl w:ilvl="6" w:tentative="1">
+      <w:start w:val="1"/>
+      <w:numFmt w:val="bullet"/>
+      <w:lvlText w:val=""/>
+      <w:lvlJc w:val="left"/>
+      <w:pPr>
+        <w:tabs>
+          <w:tab w:val="num" w:pos="5040"/>
+        </w:tabs>
+        <w:ind w:left="5040" w:hanging="360"/>
+      </w:pPr>
+      <w:rPr>
+        <w:rFonts w:ascii="Wingdings" w:hAnsi="Wingdings" w:hint="default"/>
+        <w:sz w:val="20"/>
+      </w:rPr>
+    </w:lvl>
+    <w:lvl w:ilvl="7" w:tentative="1">
+      <w:start w:val="1"/>
+      <w:numFmt w:val="bullet"/>
+      <w:lvlText w:val=""/>
+      <w:lvlJc w:val="left"/>
+      <w:pPr>
+        <w:tabs>
+          <w:tab w:val="num" w:pos="5760"/>
+        </w:tabs>
+        <w:ind w:left="5760" w:hanging="360"/>
+      </w:pPr>
+      <w:rPr>
+        <w:rFonts w:ascii="Wingdings" w:hAnsi="Wingdings" w:hint="default"/>
+        <w:sz w:val="20"/>
+      </w:rPr>
+    </w:lvl>
+    <w:lvl w:ilvl="8" w:tentative="1">
+      <w:start w:val="1"/>
+      <w:numFmt w:val="bullet"/>
+      <w:lvlText w:val=""/>
+      <w:lvlJc w:val="left"/>
+      <w:pPr>
+        <w:tabs>
+          <w:tab w:val="num" w:pos="6480"/>
+        </w:tabs>
+        <w:ind w:left="6480" w:hanging="360"/>
+      </w:pPr>
+      <w:rPr>
+        <w:rFonts w:ascii="Wingdings" w:hAnsi="Wingdings" w:hint="default"/>
+        <w:sz w:val="20"/>
+      </w:rPr>
+    </w:lvl>
+  </w:abstractNum>
+  <w:abstractNum w:abstractNumId="19" w15:restartNumberingAfterBreak="0">
+    <w:nsid w:val="72D4731B"/>
+    <w:multiLevelType w:val="multilevel"/>
+    <w:tmpl w:val="645A3564"/>
+    <w:lvl w:ilvl="0">
+      <w:start w:val="1"/>
+      <w:numFmt w:val="bullet"/>
+      <w:lvlText w:val=""/>
+      <w:lvlJc w:val="left"/>
+      <w:pPr>
+        <w:tabs>
+          <w:tab w:val="num" w:pos="720"/>
+        </w:tabs>
+        <w:ind w:left="720" w:hanging="360"/>
+      </w:pPr>
+      <w:rPr>
+        <w:rFonts w:ascii="Symbol" w:hAnsi="Symbol" w:hint="default"/>
+        <w:sz w:val="20"/>
+      </w:rPr>
+    </w:lvl>
+    <w:lvl w:ilvl="1" w:tentative="1">
+      <w:start w:val="1"/>
+      <w:numFmt w:val="bullet"/>
+      <w:lvlText w:val="o"/>
+      <w:lvlJc w:val="left"/>
+      <w:pPr>
+        <w:tabs>
+          <w:tab w:val="num" w:pos="1440"/>
+        </w:tabs>
+        <w:ind w:left="1440" w:hanging="360"/>
+      </w:pPr>
+      <w:rPr>
+        <w:rFonts w:ascii="Courier New" w:hAnsi="Courier New" w:hint="default"/>
+        <w:sz w:val="20"/>
+      </w:rPr>
+    </w:lvl>
+    <w:lvl w:ilvl="2" w:tentative="1">
+      <w:start w:val="1"/>
+      <w:numFmt w:val="bullet"/>
+      <w:lvlText w:val=""/>
+      <w:lvlJc w:val="left"/>
+      <w:pPr>
+        <w:tabs>
+          <w:tab w:val="num" w:pos="2160"/>
+        </w:tabs>
+        <w:ind w:left="2160" w:hanging="360"/>
+      </w:pPr>
+      <w:rPr>
+        <w:rFonts w:ascii="Wingdings" w:hAnsi="Wingdings" w:hint="default"/>
+        <w:sz w:val="20"/>
+      </w:rPr>
+    </w:lvl>
+    <w:lvl w:ilvl="3" w:tentative="1">
+      <w:start w:val="1"/>
+      <w:numFmt w:val="bullet"/>
+      <w:lvlText w:val=""/>
+      <w:lvlJc w:val="left"/>
+      <w:pPr>
+        <w:tabs>
+          <w:tab w:val="num" w:pos="2880"/>
+        </w:tabs>
+        <w:ind w:left="2880" w:hanging="360"/>
+      </w:pPr>
+      <w:rPr>
+        <w:rFonts w:ascii="Wingdings" w:hAnsi="Wingdings" w:hint="default"/>
+        <w:sz w:val="20"/>
+      </w:rPr>
+    </w:lvl>
+    <w:lvl w:ilvl="4" w:tentative="1">
+      <w:start w:val="1"/>
+      <w:numFmt w:val="bullet"/>
+      <w:lvlText w:val=""/>
+      <w:lvlJc w:val="left"/>
+      <w:pPr>
+        <w:tabs>
+          <w:tab w:val="num" w:pos="3600"/>
+        </w:tabs>
+        <w:ind w:left="3600" w:hanging="360"/>
+      </w:pPr>
+      <w:rPr>
+        <w:rFonts w:ascii="Wingdings" w:hAnsi="Wingdings" w:hint="default"/>
+        <w:sz w:val="20"/>
+      </w:rPr>
+    </w:lvl>
+    <w:lvl w:ilvl="5" w:tentative="1">
+      <w:start w:val="1"/>
+      <w:numFmt w:val="bullet"/>
+      <w:lvlText w:val=""/>
+      <w:lvlJc w:val="left"/>
+      <w:pPr>
+        <w:tabs>
+          <w:tab w:val="num" w:pos="4320"/>
+        </w:tabs>
+        <w:ind w:left="4320" w:hanging="360"/>
+      </w:pPr>
+      <w:rPr>
+        <w:rFonts w:ascii="Wingdings" w:hAnsi="Wingdings" w:hint="default"/>
+        <w:sz w:val="20"/>
+      </w:rPr>
+    </w:lvl>
+    <w:lvl w:ilvl="6" w:tentative="1">
+      <w:start w:val="1"/>
+      <w:numFmt w:val="bullet"/>
+      <w:lvlText w:val=""/>
+      <w:lvlJc w:val="left"/>
+      <w:pPr>
+        <w:tabs>
+          <w:tab w:val="num" w:pos="5040"/>
+        </w:tabs>
+        <w:ind w:left="5040" w:hanging="360"/>
+      </w:pPr>
+      <w:rPr>
+        <w:rFonts w:ascii="Wingdings" w:hAnsi="Wingdings" w:hint="default"/>
+        <w:sz w:val="20"/>
+      </w:rPr>
+    </w:lvl>
+    <w:lvl w:ilvl="7" w:tentative="1">
+      <w:start w:val="1"/>
+      <w:numFmt w:val="bullet"/>
+      <w:lvlText w:val=""/>
+      <w:lvlJc w:val="left"/>
+      <w:pPr>
+        <w:tabs>
+          <w:tab w:val="num" w:pos="5760"/>
+        </w:tabs>
+        <w:ind w:left="5760" w:hanging="360"/>
+      </w:pPr>
+      <w:rPr>
+        <w:rFonts w:ascii="Wingdings" w:hAnsi="Wingdings" w:hint="default"/>
+        <w:sz w:val="20"/>
+      </w:rPr>
+    </w:lvl>
+    <w:lvl w:ilvl="8" w:tentative="1">
+      <w:start w:val="1"/>
+      <w:numFmt w:val="bullet"/>
+      <w:lvlText w:val=""/>
+      <w:lvlJc w:val="left"/>
+      <w:pPr>
+        <w:tabs>
+          <w:tab w:val="num" w:pos="6480"/>
+        </w:tabs>
+        <w:ind w:left="6480" w:hanging="360"/>
+      </w:pPr>
+      <w:rPr>
+        <w:rFonts w:ascii="Wingdings" w:hAnsi="Wingdings" w:hint="default"/>
+        <w:sz w:val="20"/>
+      </w:rPr>
+    </w:lvl>
+  </w:abstractNum>
+  <w:abstractNum w:abstractNumId="20" w15:restartNumberingAfterBreak="0">
     <w:nsid w:val="73EC6AD4"/>
     <w:multiLevelType w:val="multilevel"/>
     <w:tmpl w:val="432E85F8"/>
@@ -4596,20 +7093,169 @@
       </w:rPr>
     </w:lvl>
   </w:abstractNum>
+  <w:abstractNum w:abstractNumId="21" w15:restartNumberingAfterBreak="0">
+    <w:nsid w:val="7ECE66C8"/>
+    <w:multiLevelType w:val="multilevel"/>
+    <w:tmpl w:val="89D05068"/>
+    <w:lvl w:ilvl="0">
+      <w:start w:val="1"/>
+      <w:numFmt w:val="bullet"/>
+      <w:lvlText w:val=""/>
+      <w:lvlJc w:val="left"/>
+      <w:pPr>
+        <w:tabs>
+          <w:tab w:val="num" w:pos="720"/>
+        </w:tabs>
+        <w:ind w:left="720" w:hanging="360"/>
+      </w:pPr>
+      <w:rPr>
+        <w:rFonts w:ascii="Symbol" w:hAnsi="Symbol" w:hint="default"/>
+        <w:sz w:val="20"/>
+      </w:rPr>
+    </w:lvl>
+    <w:lvl w:ilvl="1" w:tentative="1">
+      <w:start w:val="1"/>
+      <w:numFmt w:val="bullet"/>
+      <w:lvlText w:val="o"/>
+      <w:lvlJc w:val="left"/>
+      <w:pPr>
+        <w:tabs>
+          <w:tab w:val="num" w:pos="1440"/>
+        </w:tabs>
+        <w:ind w:left="1440" w:hanging="360"/>
+      </w:pPr>
+      <w:rPr>
+        <w:rFonts w:ascii="Courier New" w:hAnsi="Courier New" w:hint="default"/>
+        <w:sz w:val="20"/>
+      </w:rPr>
+    </w:lvl>
+    <w:lvl w:ilvl="2" w:tentative="1">
+      <w:start w:val="1"/>
+      <w:numFmt w:val="bullet"/>
+      <w:lvlText w:val=""/>
+      <w:lvlJc w:val="left"/>
+      <w:pPr>
+        <w:tabs>
+          <w:tab w:val="num" w:pos="2160"/>
+        </w:tabs>
+        <w:ind w:left="2160" w:hanging="360"/>
+      </w:pPr>
+      <w:rPr>
+        <w:rFonts w:ascii="Wingdings" w:hAnsi="Wingdings" w:hint="default"/>
+        <w:sz w:val="20"/>
+      </w:rPr>
+    </w:lvl>
+    <w:lvl w:ilvl="3" w:tentative="1">
+      <w:start w:val="1"/>
+      <w:numFmt w:val="bullet"/>
+      <w:lvlText w:val=""/>
+      <w:lvlJc w:val="left"/>
+      <w:pPr>
+        <w:tabs>
+          <w:tab w:val="num" w:pos="2880"/>
+        </w:tabs>
+        <w:ind w:left="2880" w:hanging="360"/>
+      </w:pPr>
+      <w:rPr>
+        <w:rFonts w:ascii="Wingdings" w:hAnsi="Wingdings" w:hint="default"/>
+        <w:sz w:val="20"/>
+      </w:rPr>
+    </w:lvl>
+    <w:lvl w:ilvl="4" w:tentative="1">
+      <w:start w:val="1"/>
+      <w:numFmt w:val="bullet"/>
+      <w:lvlText w:val=""/>
+      <w:lvlJc w:val="left"/>
+      <w:pPr>
+        <w:tabs>
+          <w:tab w:val="num" w:pos="3600"/>
+        </w:tabs>
+        <w:ind w:left="3600" w:hanging="360"/>
+      </w:pPr>
+      <w:rPr>
+        <w:rFonts w:ascii="Wingdings" w:hAnsi="Wingdings" w:hint="default"/>
+        <w:sz w:val="20"/>
+      </w:rPr>
+    </w:lvl>
+    <w:lvl w:ilvl="5" w:tentative="1">
+      <w:start w:val="1"/>
+      <w:numFmt w:val="bullet"/>
+      <w:lvlText w:val=""/>
+      <w:lvlJc w:val="left"/>
+      <w:pPr>
+        <w:tabs>
+          <w:tab w:val="num" w:pos="4320"/>
+        </w:tabs>
+        <w:ind w:left="4320" w:hanging="360"/>
+      </w:pPr>
+      <w:rPr>
+        <w:rFonts w:ascii="Wingdings" w:hAnsi="Wingdings" w:hint="default"/>
+        <w:sz w:val="20"/>
+      </w:rPr>
+    </w:lvl>
+    <w:lvl w:ilvl="6" w:tentative="1">
+      <w:start w:val="1"/>
+      <w:numFmt w:val="bullet"/>
+      <w:lvlText w:val=""/>
+      <w:lvlJc w:val="left"/>
+      <w:pPr>
+        <w:tabs>
+          <w:tab w:val="num" w:pos="5040"/>
+        </w:tabs>
+        <w:ind w:left="5040" w:hanging="360"/>
+      </w:pPr>
+      <w:rPr>
+        <w:rFonts w:ascii="Wingdings" w:hAnsi="Wingdings" w:hint="default"/>
+        <w:sz w:val="20"/>
+      </w:rPr>
+    </w:lvl>
+    <w:lvl w:ilvl="7" w:tentative="1">
+      <w:start w:val="1"/>
+      <w:numFmt w:val="bullet"/>
+      <w:lvlText w:val=""/>
+      <w:lvlJc w:val="left"/>
+      <w:pPr>
+        <w:tabs>
+          <w:tab w:val="num" w:pos="5760"/>
+        </w:tabs>
+        <w:ind w:left="5760" w:hanging="360"/>
+      </w:pPr>
+      <w:rPr>
+        <w:rFonts w:ascii="Wingdings" w:hAnsi="Wingdings" w:hint="default"/>
+        <w:sz w:val="20"/>
+      </w:rPr>
+    </w:lvl>
+    <w:lvl w:ilvl="8" w:tentative="1">
+      <w:start w:val="1"/>
+      <w:numFmt w:val="bullet"/>
+      <w:lvlText w:val=""/>
+      <w:lvlJc w:val="left"/>
+      <w:pPr>
+        <w:tabs>
+          <w:tab w:val="num" w:pos="6480"/>
+        </w:tabs>
+        <w:ind w:left="6480" w:hanging="360"/>
+      </w:pPr>
+      <w:rPr>
+        <w:rFonts w:ascii="Wingdings" w:hAnsi="Wingdings" w:hint="default"/>
+        <w:sz w:val="20"/>
+      </w:rPr>
+    </w:lvl>
+  </w:abstractNum>
   <w:num w:numId="1" w16cid:durableId="1984386260">
-    <w:abstractNumId w:val="13"/>
+    <w:abstractNumId w:val="20"/>
   </w:num>
   <w:num w:numId="2" w16cid:durableId="1893224603">
-    <w:abstractNumId w:val="11"/>
+    <w:abstractNumId w:val="14"/>
   </w:num>
   <w:num w:numId="3" w16cid:durableId="1890072280">
     <w:abstractNumId w:val="1"/>
   </w:num>
   <w:num w:numId="4" w16cid:durableId="1088572646">
-    <w:abstractNumId w:val="8"/>
+    <w:abstractNumId w:val="11"/>
   </w:num>
   <w:num w:numId="5" w16cid:durableId="657920859">
-    <w:abstractNumId w:val="5"/>
+    <w:abstractNumId w:val="6"/>
   </w:num>
   <w:num w:numId="6" w16cid:durableId="1175076550">
     <w:abstractNumId w:val="0"/>
@@ -4624,19 +7270,43 @@
     <w:abstractNumId w:val="4"/>
   </w:num>
   <w:num w:numId="10" w16cid:durableId="1123230890">
-    <w:abstractNumId w:val="6"/>
+    <w:abstractNumId w:val="9"/>
   </w:num>
   <w:num w:numId="11" w16cid:durableId="51580383">
-    <w:abstractNumId w:val="9"/>
+    <w:abstractNumId w:val="12"/>
   </w:num>
   <w:num w:numId="12" w16cid:durableId="210001611">
+    <w:abstractNumId w:val="13"/>
+  </w:num>
+  <w:num w:numId="13" w16cid:durableId="1354382521">
+    <w:abstractNumId w:val="17"/>
+  </w:num>
+  <w:num w:numId="14" w16cid:durableId="179129715">
     <w:abstractNumId w:val="10"/>
   </w:num>
-  <w:num w:numId="13" w16cid:durableId="1354382521">
-    <w:abstractNumId w:val="12"/>
+  <w:num w:numId="15" w16cid:durableId="5981309">
+    <w:abstractNumId w:val="21"/>
   </w:num>
-  <w:num w:numId="14" w16cid:durableId="179129715">
+  <w:num w:numId="16" w16cid:durableId="1264460135">
+    <w:abstractNumId w:val="18"/>
+  </w:num>
+  <w:num w:numId="17" w16cid:durableId="1886335427">
     <w:abstractNumId w:val="7"/>
+  </w:num>
+  <w:num w:numId="18" w16cid:durableId="415440753">
+    <w:abstractNumId w:val="8"/>
+  </w:num>
+  <w:num w:numId="19" w16cid:durableId="1930769861">
+    <w:abstractNumId w:val="16"/>
+  </w:num>
+  <w:num w:numId="20" w16cid:durableId="1697340721">
+    <w:abstractNumId w:val="19"/>
+  </w:num>
+  <w:num w:numId="21" w16cid:durableId="964701797">
+    <w:abstractNumId w:val="15"/>
+  </w:num>
+  <w:num w:numId="22" w16cid:durableId="1180697704">
+    <w:abstractNumId w:val="5"/>
   </w:num>
 </w:numbering>
 </file>
@@ -5244,7 +7914,6 @@
   <w:style w:type="character" w:default="1" w:styleId="VarsaylanParagrafYazTipi">
     <w:name w:val="Default Paragraph Font"/>
     <w:uiPriority w:val="1"/>
-    <w:semiHidden/>
     <w:unhideWhenUsed/>
   </w:style>
   <w:style w:type="table" w:default="1" w:styleId="NormalTablo">

</xml_diff>